<commit_message>
Ajustes de hallazgos repo 2
</commit_message>
<xml_diff>
--- a/fuentes/124108_CF01_DU.docx
+++ b/fuentes/124108_CF01_DU.docx
@@ -603,7 +603,7 @@
           <w:r>
             <w:fldChar w:fldCharType="separate"/>
           </w:r>
-          <w:hyperlink w:anchor="_Toc232584223" w:history="1">
+          <w:hyperlink w:anchor="_Toc234503615" w:history="1">
             <w:r>
               <w:rPr>
                 <w:rStyle w:val="Hipervnculo"/>
@@ -630,7 +630,7 @@
                 <w:noProof/>
                 <w:webHidden/>
               </w:rPr>
-              <w:instrText xml:space="preserve"> PAGEREF _Toc232584223 \h </w:instrText>
+              <w:instrText xml:space="preserve"> PAGEREF _Toc234503615 \h </w:instrText>
             </w:r>
             <w:r>
               <w:rPr>
@@ -676,7 +676,7 @@
               <w:lang w:eastAsia="es-CO"/>
             </w:rPr>
           </w:pPr>
-          <w:hyperlink w:anchor="_Toc232584224" w:history="1">
+          <w:hyperlink w:anchor="_Toc234503616" w:history="1">
             <w:r>
               <w:rPr>
                 <w:rStyle w:val="Hipervnculo"/>
@@ -720,7 +720,7 @@
                 <w:noProof/>
                 <w:webHidden/>
               </w:rPr>
-              <w:instrText xml:space="preserve"> PAGEREF _Toc232584224 \h </w:instrText>
+              <w:instrText xml:space="preserve"> PAGEREF _Toc234503616 \h </w:instrText>
             </w:r>
             <w:r>
               <w:rPr>
@@ -766,7 +766,7 @@
               <w:lang w:eastAsia="es-CO"/>
             </w:rPr>
           </w:pPr>
-          <w:hyperlink w:anchor="_Toc232584225" w:history="1">
+          <w:hyperlink w:anchor="_Toc234503617" w:history="1">
             <w:r>
               <w:rPr>
                 <w:rStyle w:val="Hipervnculo"/>
@@ -810,7 +810,7 @@
                 <w:noProof/>
                 <w:webHidden/>
               </w:rPr>
-              <w:instrText xml:space="preserve"> PAGEREF _Toc232584225 \h </w:instrText>
+              <w:instrText xml:space="preserve"> PAGEREF _Toc234503617 \h </w:instrText>
             </w:r>
             <w:r>
               <w:rPr>
@@ -856,7 +856,7 @@
               <w:lang w:eastAsia="es-CO"/>
             </w:rPr>
           </w:pPr>
-          <w:hyperlink w:anchor="_Toc232584226" w:history="1">
+          <w:hyperlink w:anchor="_Toc234503618" w:history="1">
             <w:r>
               <w:rPr>
                 <w:rStyle w:val="Hipervnculo"/>
@@ -900,7 +900,7 @@
                 <w:noProof/>
                 <w:webHidden/>
               </w:rPr>
-              <w:instrText xml:space="preserve"> PAGEREF _Toc232584226 \h </w:instrText>
+              <w:instrText xml:space="preserve"> PAGEREF _Toc234503618 \h </w:instrText>
             </w:r>
             <w:r>
               <w:rPr>
@@ -946,7 +946,7 @@
               <w:lang w:eastAsia="es-CO"/>
             </w:rPr>
           </w:pPr>
-          <w:hyperlink w:anchor="_Toc232584227" w:history="1">
+          <w:hyperlink w:anchor="_Toc234503619" w:history="1">
             <w:r>
               <w:rPr>
                 <w:rStyle w:val="Hipervnculo"/>
@@ -990,7 +990,7 @@
                 <w:noProof/>
                 <w:webHidden/>
               </w:rPr>
-              <w:instrText xml:space="preserve"> PAGEREF _Toc232584227 \h </w:instrText>
+              <w:instrText xml:space="preserve"> PAGEREF _Toc234503619 \h </w:instrText>
             </w:r>
             <w:r>
               <w:rPr>
@@ -1036,7 +1036,7 @@
               <w:lang w:eastAsia="es-CO"/>
             </w:rPr>
           </w:pPr>
-          <w:hyperlink w:anchor="_Toc232584228" w:history="1">
+          <w:hyperlink w:anchor="_Toc234503620" w:history="1">
             <w:r>
               <w:rPr>
                 <w:rStyle w:val="Hipervnculo"/>
@@ -1080,7 +1080,7 @@
                 <w:noProof/>
                 <w:webHidden/>
               </w:rPr>
-              <w:instrText xml:space="preserve"> PAGEREF _Toc232584228 \h </w:instrText>
+              <w:instrText xml:space="preserve"> PAGEREF _Toc234503620 \h </w:instrText>
             </w:r>
             <w:r>
               <w:rPr>
@@ -1126,7 +1126,7 @@
               <w:lang w:eastAsia="es-CO"/>
             </w:rPr>
           </w:pPr>
-          <w:hyperlink w:anchor="_Toc232584229" w:history="1">
+          <w:hyperlink w:anchor="_Toc234503621" w:history="1">
             <w:r>
               <w:rPr>
                 <w:rStyle w:val="Hipervnculo"/>
@@ -1170,7 +1170,7 @@
                 <w:noProof/>
                 <w:webHidden/>
               </w:rPr>
-              <w:instrText xml:space="preserve"> PAGEREF _Toc232584229 \h </w:instrText>
+              <w:instrText xml:space="preserve"> PAGEREF _Toc234503621 \h </w:instrText>
             </w:r>
             <w:r>
               <w:rPr>
@@ -1212,7 +1212,7 @@
               <w:lang w:eastAsia="es-CO"/>
             </w:rPr>
           </w:pPr>
-          <w:hyperlink w:anchor="_Toc232584230" w:history="1">
+          <w:hyperlink w:anchor="_Toc234503622" w:history="1">
             <w:r>
               <w:rPr>
                 <w:rStyle w:val="Hipervnculo"/>
@@ -1256,7 +1256,7 @@
                 <w:noProof/>
                 <w:webHidden/>
               </w:rPr>
-              <w:instrText xml:space="preserve"> PAGEREF _Toc232584230 \h </w:instrText>
+              <w:instrText xml:space="preserve"> PAGEREF _Toc234503622 \h </w:instrText>
             </w:r>
             <w:r>
               <w:rPr>
@@ -1302,7 +1302,7 @@
               <w:lang w:eastAsia="es-CO"/>
             </w:rPr>
           </w:pPr>
-          <w:hyperlink w:anchor="_Toc232584231" w:history="1">
+          <w:hyperlink w:anchor="_Toc234503623" w:history="1">
             <w:r>
               <w:rPr>
                 <w:rStyle w:val="Hipervnculo"/>
@@ -1362,7 +1362,7 @@
                 <w:noProof/>
                 <w:webHidden/>
               </w:rPr>
-              <w:instrText xml:space="preserve"> PAGEREF _Toc232584231 \h </w:instrText>
+              <w:instrText xml:space="preserve"> PAGEREF _Toc234503623 \h </w:instrText>
             </w:r>
             <w:r>
               <w:rPr>
@@ -1404,7 +1404,7 @@
               <w:lang w:eastAsia="es-CO"/>
             </w:rPr>
           </w:pPr>
-          <w:hyperlink w:anchor="_Toc232584232" w:history="1">
+          <w:hyperlink w:anchor="_Toc234503624" w:history="1">
             <w:r>
               <w:rPr>
                 <w:rStyle w:val="Hipervnculo"/>
@@ -1448,7 +1448,7 @@
                 <w:noProof/>
                 <w:webHidden/>
               </w:rPr>
-              <w:instrText xml:space="preserve"> PAGEREF _Toc232584232 \h </w:instrText>
+              <w:instrText xml:space="preserve"> PAGEREF _Toc234503624 \h </w:instrText>
             </w:r>
             <w:r>
               <w:rPr>
@@ -1490,7 +1490,7 @@
               <w:lang w:eastAsia="es-CO"/>
             </w:rPr>
           </w:pPr>
-          <w:hyperlink w:anchor="_Toc232584233" w:history="1">
+          <w:hyperlink w:anchor="_Toc234503625" w:history="1">
             <w:r>
               <w:rPr>
                 <w:rStyle w:val="Hipervnculo"/>
@@ -1534,7 +1534,7 @@
                 <w:noProof/>
                 <w:webHidden/>
               </w:rPr>
-              <w:instrText xml:space="preserve"> PAGEREF _Toc232584233 \h </w:instrText>
+              <w:instrText xml:space="preserve"> PAGEREF _Toc234503625 \h </w:instrText>
             </w:r>
             <w:r>
               <w:rPr>
@@ -1576,7 +1576,7 @@
               <w:lang w:eastAsia="es-CO"/>
             </w:rPr>
           </w:pPr>
-          <w:hyperlink w:anchor="_Toc232584234" w:history="1">
+          <w:hyperlink w:anchor="_Toc234503626" w:history="1">
             <w:r>
               <w:rPr>
                 <w:rStyle w:val="Hipervnculo"/>
@@ -1620,7 +1620,7 @@
                 <w:noProof/>
                 <w:webHidden/>
               </w:rPr>
-              <w:instrText xml:space="preserve"> PAGEREF _Toc232584234 \h </w:instrText>
+              <w:instrText xml:space="preserve"> PAGEREF _Toc234503626 \h </w:instrText>
             </w:r>
             <w:r>
               <w:rPr>
@@ -1662,7 +1662,7 @@
               <w:lang w:eastAsia="es-CO"/>
             </w:rPr>
           </w:pPr>
-          <w:hyperlink w:anchor="_Toc232584235" w:history="1">
+          <w:hyperlink w:anchor="_Toc234503627" w:history="1">
             <w:r>
               <w:rPr>
                 <w:rStyle w:val="Hipervnculo"/>
@@ -1706,7 +1706,7 @@
                 <w:noProof/>
                 <w:webHidden/>
               </w:rPr>
-              <w:instrText xml:space="preserve"> PAGEREF _Toc232584235 \h </w:instrText>
+              <w:instrText xml:space="preserve"> PAGEREF _Toc234503627 \h </w:instrText>
             </w:r>
             <w:r>
               <w:rPr>
@@ -1751,7 +1751,7 @@
               <w:lang w:eastAsia="es-CO"/>
             </w:rPr>
           </w:pPr>
-          <w:hyperlink w:anchor="_Toc232584236" w:history="1">
+          <w:hyperlink w:anchor="_Toc234503628" w:history="1">
             <w:r>
               <w:rPr>
                 <w:rStyle w:val="Hipervnculo"/>
@@ -1778,7 +1778,7 @@
                 <w:noProof/>
                 <w:webHidden/>
               </w:rPr>
-              <w:instrText xml:space="preserve"> PAGEREF _Toc232584236 \h </w:instrText>
+              <w:instrText xml:space="preserve"> PAGEREF _Toc234503628 \h </w:instrText>
             </w:r>
             <w:r>
               <w:rPr>
@@ -1798,7 +1798,7 @@
                 <w:noProof/>
                 <w:webHidden/>
               </w:rPr>
-              <w:t>29</w:t>
+              <w:t>30</w:t>
             </w:r>
             <w:r>
               <w:rPr>
@@ -1823,7 +1823,7 @@
               <w:lang w:eastAsia="es-CO"/>
             </w:rPr>
           </w:pPr>
-          <w:hyperlink w:anchor="_Toc232584237" w:history="1">
+          <w:hyperlink w:anchor="_Toc234503629" w:history="1">
             <w:r>
               <w:rPr>
                 <w:rStyle w:val="Hipervnculo"/>
@@ -1850,7 +1850,7 @@
                 <w:noProof/>
                 <w:webHidden/>
               </w:rPr>
-              <w:instrText xml:space="preserve"> PAGEREF _Toc232584237 \h </w:instrText>
+              <w:instrText xml:space="preserve"> PAGEREF _Toc234503629 \h </w:instrText>
             </w:r>
             <w:r>
               <w:rPr>
@@ -1870,7 +1870,7 @@
                 <w:noProof/>
                 <w:webHidden/>
               </w:rPr>
-              <w:t>30</w:t>
+              <w:t>31</w:t>
             </w:r>
             <w:r>
               <w:rPr>
@@ -1895,7 +1895,7 @@
               <w:lang w:eastAsia="es-CO"/>
             </w:rPr>
           </w:pPr>
-          <w:hyperlink w:anchor="_Toc232584238" w:history="1">
+          <w:hyperlink w:anchor="_Toc234503630" w:history="1">
             <w:r>
               <w:rPr>
                 <w:rStyle w:val="Hipervnculo"/>
@@ -1922,7 +1922,7 @@
                 <w:noProof/>
                 <w:webHidden/>
               </w:rPr>
-              <w:instrText xml:space="preserve"> PAGEREF _Toc232584238 \h </w:instrText>
+              <w:instrText xml:space="preserve"> PAGEREF _Toc234503630 \h </w:instrText>
             </w:r>
             <w:r>
               <w:rPr>
@@ -1942,7 +1942,7 @@
                 <w:noProof/>
                 <w:webHidden/>
               </w:rPr>
-              <w:t>31</w:t>
+              <w:t>32</w:t>
             </w:r>
             <w:r>
               <w:rPr>
@@ -1967,7 +1967,7 @@
               <w:lang w:eastAsia="es-CO"/>
             </w:rPr>
           </w:pPr>
-          <w:hyperlink w:anchor="_Toc232584239" w:history="1">
+          <w:hyperlink w:anchor="_Toc234503631" w:history="1">
             <w:r>
               <w:rPr>
                 <w:rStyle w:val="Hipervnculo"/>
@@ -1994,7 +1994,7 @@
                 <w:noProof/>
                 <w:webHidden/>
               </w:rPr>
-              <w:instrText xml:space="preserve"> PAGEREF _Toc232584239 \h </w:instrText>
+              <w:instrText xml:space="preserve"> PAGEREF _Toc234503631 \h </w:instrText>
             </w:r>
             <w:r>
               <w:rPr>
@@ -2014,7 +2014,7 @@
                 <w:noProof/>
                 <w:webHidden/>
               </w:rPr>
-              <w:t>33</w:t>
+              <w:t>35</w:t>
             </w:r>
             <w:r>
               <w:rPr>
@@ -2059,7 +2059,7 @@
       <w:pPr>
         <w:pStyle w:val="Titulosgenerales"/>
       </w:pPr>
-      <w:bookmarkStart w:id="0" w:name="_Toc232584223"/>
+      <w:bookmarkStart w:id="0" w:name="_Toc234503615"/>
       <w:r>
         <w:lastRenderedPageBreak/>
         <w:t>Introducción</w:t>
@@ -2089,7 +2089,7 @@
           <w:noProof/>
         </w:rPr>
         <w:drawing>
-          <wp:inline distT="0" distB="0" distL="0" distR="0" wp14:anchorId="0C5228ED" wp14:editId="76EA6C30">
+          <wp:inline distT="0" distB="0" distL="0" distR="0" wp14:anchorId="0C5228ED" wp14:editId="401AE8FC">
             <wp:extent cx="4680000" cy="2632500"/>
             <wp:effectExtent l="0" t="0" r="6350" b="0"/>
             <wp:docPr id="1" name="Imagen 1">
@@ -2625,7 +2625,7 @@
       <w:pPr>
         <w:pStyle w:val="Ttulo1"/>
       </w:pPr>
-      <w:bookmarkStart w:id="1" w:name="_Toc232584224"/>
+      <w:bookmarkStart w:id="1" w:name="_Toc234503616"/>
       <w:r>
         <w:lastRenderedPageBreak/>
         <w:t>Introducción al mercadeo</w:t>
@@ -2780,7 +2780,21 @@
         <w:rPr>
           <w:lang w:val="es-419" w:eastAsia="es-CO"/>
         </w:rPr>
-        <w:t>(American Marketing Association, 2017).</w:t>
+        <w:t xml:space="preserve">(American Marketing </w:t>
+      </w:r>
+      <w:proofErr w:type="spellStart"/>
+      <w:r>
+        <w:rPr>
+          <w:lang w:val="es-419" w:eastAsia="es-CO"/>
+        </w:rPr>
+        <w:t>Association</w:t>
+      </w:r>
+      <w:proofErr w:type="spellEnd"/>
+      <w:r>
+        <w:rPr>
+          <w:lang w:val="es-419" w:eastAsia="es-CO"/>
+        </w:rPr>
+        <w:t>, 2017).</w:t>
       </w:r>
     </w:p>
     <w:p>
@@ -2913,7 +2927,21 @@
         <w:rPr>
           <w:lang w:val="es-419" w:eastAsia="es-CO"/>
         </w:rPr>
-        <w:t xml:space="preserve">De acuerdo con Solomon y Stuart (como se citó en Rosenstiehl, 2016), “el concepto de </w:t>
+        <w:t xml:space="preserve">De acuerdo con Solomon y Stuart (como se citó en </w:t>
+      </w:r>
+      <w:proofErr w:type="spellStart"/>
+      <w:r>
+        <w:rPr>
+          <w:lang w:val="es-419" w:eastAsia="es-CO"/>
+        </w:rPr>
+        <w:t>Rosenstiehl</w:t>
+      </w:r>
+      <w:proofErr w:type="spellEnd"/>
+      <w:r>
+        <w:rPr>
+          <w:lang w:val="es-419" w:eastAsia="es-CO"/>
+        </w:rPr>
+        <w:t xml:space="preserve">, 2016), “el concepto de </w:t>
       </w:r>
       <w:r>
         <w:rPr>
@@ -3316,7 +3344,23 @@
                 <w:rFonts w:cstheme="minorHAnsi"/>
                 <w:szCs w:val="28"/>
               </w:rPr>
-              <w:t>Uno de los acontecimientos que se convierte en un hito para la evolución del mercadeo es la imprenta, que aparece en 1440, pues acompaña y ayuda en el proceso de comunicación, materializando medios impresos para dar a conocer la oferta de bienes y servicios</w:t>
+              <w:t xml:space="preserve">Uno de los acontecimientos que se convierte en un hito para la evolución del </w:t>
+            </w:r>
+            <w:proofErr w:type="spellStart"/>
+            <w:r>
+              <w:rPr>
+                <w:rFonts w:cstheme="minorHAnsi"/>
+                <w:szCs w:val="28"/>
+              </w:rPr>
+              <w:t>mercadeo</w:t>
+            </w:r>
+            <w:proofErr w:type="spellEnd"/>
+            <w:r>
+              <w:rPr>
+                <w:rFonts w:cstheme="minorHAnsi"/>
+                <w:szCs w:val="28"/>
+              </w:rPr>
+              <w:t xml:space="preserve"> es la imprenta, que aparece en 1440, pues acompaña y ayuda en el proceso de comunicación, materializando medios impresos para dar a conocer la oferta de bienes y servicios</w:t>
             </w:r>
             <w:r>
               <w:rPr>
@@ -3544,8 +3588,17 @@
                 <w:rFonts w:cstheme="minorHAnsi"/>
                 <w:szCs w:val="28"/>
               </w:rPr>
-              <w:t>Esta intensidad competitiva establece en gran medida la evolución del mercadeo</w:t>
-            </w:r>
+              <w:t xml:space="preserve">Esta intensidad competitiva establece en gran medida la evolución del </w:t>
+            </w:r>
+            <w:proofErr w:type="spellStart"/>
+            <w:r>
+              <w:rPr>
+                <w:rFonts w:cstheme="minorHAnsi"/>
+                <w:szCs w:val="28"/>
+              </w:rPr>
+              <w:t>mercadeo</w:t>
+            </w:r>
+            <w:proofErr w:type="spellEnd"/>
             <w:r>
               <w:rPr>
                 <w:rFonts w:cstheme="minorHAnsi"/>
@@ -3801,7 +3854,7 @@
       <w:pPr>
         <w:pStyle w:val="Ttulo1"/>
       </w:pPr>
-      <w:bookmarkStart w:id="2" w:name="_Toc232584225"/>
+      <w:bookmarkStart w:id="2" w:name="_Toc234503617"/>
       <w:r>
         <w:lastRenderedPageBreak/>
         <w:t>Tipos de mercadeo</w:t>
@@ -4004,7 +4057,7 @@
       <w:pPr>
         <w:pStyle w:val="Ttulo1"/>
       </w:pPr>
-      <w:bookmarkStart w:id="3" w:name="_Toc232584226"/>
+      <w:bookmarkStart w:id="3" w:name="_Toc234503618"/>
       <w:r>
         <w:lastRenderedPageBreak/>
         <w:t>Importancia del mercadeo</w:t>
@@ -4306,7 +4359,7 @@
       <w:pPr>
         <w:pStyle w:val="Ttulo1"/>
       </w:pPr>
-      <w:bookmarkStart w:id="4" w:name="_Toc232584227"/>
+      <w:bookmarkStart w:id="4" w:name="_Toc234503619"/>
       <w:r>
         <w:lastRenderedPageBreak/>
         <w:t>Variables del mercado</w:t>
@@ -4351,12 +4404,37 @@
         </w:rPr>
         <w:t>, el cual engloba los cuatros componentes básicos: precio, producto, comunicación y distribución. Estas variables son conocidas como las 4P por su acepción anglosajona (</w:t>
       </w:r>
+      <w:proofErr w:type="spellStart"/>
       <w:r>
         <w:rPr>
           <w:rStyle w:val="Extranjerismo"/>
           <w:lang w:val="es-419" w:eastAsia="es-CO"/>
         </w:rPr>
-        <w:t>product, price, place</w:t>
+        <w:t>product</w:t>
+      </w:r>
+      <w:proofErr w:type="spellEnd"/>
+      <w:r>
+        <w:rPr>
+          <w:rStyle w:val="Extranjerismo"/>
+          <w:lang w:val="es-419" w:eastAsia="es-CO"/>
+        </w:rPr>
+        <w:t xml:space="preserve">, </w:t>
+      </w:r>
+      <w:proofErr w:type="spellStart"/>
+      <w:r>
+        <w:rPr>
+          <w:rStyle w:val="Extranjerismo"/>
+          <w:lang w:val="es-419" w:eastAsia="es-CO"/>
+        </w:rPr>
+        <w:t>price</w:t>
+      </w:r>
+      <w:proofErr w:type="spellEnd"/>
+      <w:r>
+        <w:rPr>
+          <w:rStyle w:val="Extranjerismo"/>
+          <w:lang w:val="es-419" w:eastAsia="es-CO"/>
+        </w:rPr>
+        <w:t>, place</w:t>
       </w:r>
       <w:r>
         <w:rPr>
@@ -4364,6 +4442,7 @@
         </w:rPr>
         <w:t xml:space="preserve"> y </w:t>
       </w:r>
+      <w:proofErr w:type="spellStart"/>
       <w:r>
         <w:rPr>
           <w:rStyle w:val="Extranjerismo"/>
@@ -4371,6 +4450,7 @@
         </w:rPr>
         <w:t>promotion</w:t>
       </w:r>
+      <w:proofErr w:type="spellEnd"/>
       <w:r>
         <w:rPr>
           <w:lang w:val="es-419" w:eastAsia="es-CO"/>
@@ -4813,7 +4893,21 @@
         <w:rPr>
           <w:lang w:val="es-419" w:eastAsia="es-CO"/>
         </w:rPr>
-        <w:t>Con las 4C, se distinguen cuatro importantes aspectos a tener en cuenta para entender y desplegar una estrategia. Ellos son: consumidor, costo, conveniencia y comunicación. Este modelo fue propuesto por Robert F. Lauterborn, en 1990, quien vio la necesidad de actualizar, al entorno digital, el modelo del mercadeo tradicional de 4P (producto, precio, plaza y promoción), sin perder su esencia (Shum Xie, 2019</w:t>
+        <w:t xml:space="preserve">Con las 4C, se distinguen cuatro importantes aspectos a tener en cuenta para entender y desplegar una estrategia. Ellos son: consumidor, costo, conveniencia y comunicación. Este modelo fue propuesto por Robert F. Lauterborn, en 1990, quien vio la necesidad de actualizar, al entorno digital, el modelo del </w:t>
+      </w:r>
+      <w:proofErr w:type="spellStart"/>
+      <w:r>
+        <w:rPr>
+          <w:lang w:val="es-419" w:eastAsia="es-CO"/>
+        </w:rPr>
+        <w:t>mercadeo</w:t>
+      </w:r>
+      <w:proofErr w:type="spellEnd"/>
+      <w:r>
+        <w:rPr>
+          <w:lang w:val="es-419" w:eastAsia="es-CO"/>
+        </w:rPr>
+        <w:t xml:space="preserve"> tradicional de 4P (producto, precio, plaza y promoción), sin perder su esencia (Shum Xie, 2019</w:t>
       </w:r>
       <w:r>
         <w:rPr>
@@ -5008,7 +5102,7 @@
       <w:pPr>
         <w:pStyle w:val="Ttulo1"/>
       </w:pPr>
-      <w:bookmarkStart w:id="5" w:name="_Toc232584228"/>
+      <w:bookmarkStart w:id="5" w:name="_Toc234503620"/>
       <w:r>
         <w:lastRenderedPageBreak/>
         <w:t>Plan estratégico de mercadeo</w:t>
@@ -6047,7 +6141,7 @@
       <w:pPr>
         <w:pStyle w:val="Ttulo1"/>
       </w:pPr>
-      <w:bookmarkStart w:id="6" w:name="_Toc232584229"/>
+      <w:bookmarkStart w:id="6" w:name="_Toc234503621"/>
       <w:r>
         <w:lastRenderedPageBreak/>
         <w:t>Análisis de competencia</w:t>
@@ -6068,7 +6162,7 @@
       <w:pPr>
         <w:pStyle w:val="Ttulo2"/>
       </w:pPr>
-      <w:bookmarkStart w:id="7" w:name="_Toc232584230"/>
+      <w:bookmarkStart w:id="7" w:name="_Toc234503622"/>
       <w:r>
         <w:t>Dimensiones en el análisis de la competencia</w:t>
       </w:r>
@@ -6346,6 +6440,7 @@
         </w:rPr>
         <w:t xml:space="preserve">Establecer </w:t>
       </w:r>
+      <w:proofErr w:type="spellStart"/>
       <w:r>
         <w:rPr>
           <w:rStyle w:val="Extranjerismo"/>
@@ -6353,6 +6448,7 @@
         </w:rPr>
         <w:t>benchmarks</w:t>
       </w:r>
+      <w:proofErr w:type="spellEnd"/>
       <w:r>
         <w:rPr>
           <w:lang w:val="es-419" w:eastAsia="es-CO"/>
@@ -6459,7 +6555,7 @@
       <w:pPr>
         <w:pStyle w:val="Ttulo1"/>
       </w:pPr>
-      <w:bookmarkStart w:id="8" w:name="_Toc232584231"/>
+      <w:bookmarkStart w:id="8" w:name="_Toc234503623"/>
       <w:r>
         <w:lastRenderedPageBreak/>
         <w:t xml:space="preserve">Marco legal vigente, </w:t>
@@ -6492,8 +6588,17 @@
           <w:rStyle w:val="Extranjerismo"/>
           <w:lang w:val="es-419" w:eastAsia="es-CO"/>
         </w:rPr>
-        <w:t>e-commerce</w:t>
-      </w:r>
+        <w:t>e-</w:t>
+      </w:r>
+      <w:proofErr w:type="spellStart"/>
+      <w:r>
+        <w:rPr>
+          <w:rStyle w:val="Extranjerismo"/>
+          <w:lang w:val="es-419" w:eastAsia="es-CO"/>
+        </w:rPr>
+        <w:t>commerce</w:t>
+      </w:r>
+      <w:proofErr w:type="spellEnd"/>
       <w:r>
         <w:rPr>
           <w:lang w:val="es-419" w:eastAsia="es-CO"/>
@@ -6531,7 +6636,7 @@
       <w:pPr>
         <w:pStyle w:val="Ttulo2"/>
       </w:pPr>
-      <w:bookmarkStart w:id="9" w:name="_Toc232584232"/>
+      <w:bookmarkStart w:id="9" w:name="_Toc234503624"/>
       <w:r>
         <w:lastRenderedPageBreak/>
         <w:t>Generalidades del comercio electrónico</w:t>
@@ -6568,8 +6673,17 @@
           <w:rStyle w:val="Extranjerismo"/>
           <w:lang w:val="es-419" w:eastAsia="es-CO"/>
         </w:rPr>
-        <w:t>e-commerce</w:t>
-      </w:r>
+        <w:t>e-</w:t>
+      </w:r>
+      <w:proofErr w:type="spellStart"/>
+      <w:r>
+        <w:rPr>
+          <w:rStyle w:val="Extranjerismo"/>
+          <w:lang w:val="es-419" w:eastAsia="es-CO"/>
+        </w:rPr>
+        <w:t>commerce</w:t>
+      </w:r>
+      <w:proofErr w:type="spellEnd"/>
       <w:r>
         <w:rPr>
           <w:lang w:val="es-419" w:eastAsia="es-CO"/>
@@ -6727,7 +6841,7 @@
       <w:pPr>
         <w:pStyle w:val="Ttulo2"/>
       </w:pPr>
-      <w:bookmarkStart w:id="10" w:name="_Toc232584233"/>
+      <w:bookmarkStart w:id="10" w:name="_Toc234503625"/>
       <w:r>
         <w:t>Características del comercio electrónico</w:t>
       </w:r>
@@ -7024,7 +7138,7 @@
       <w:pPr>
         <w:pStyle w:val="Ttulo2"/>
       </w:pPr>
-      <w:bookmarkStart w:id="11" w:name="_Toc232584234"/>
+      <w:bookmarkStart w:id="11" w:name="_Toc234503626"/>
       <w:r>
         <w:t>Regulación del comercio electrónico</w:t>
       </w:r>
@@ -7121,12 +7235,24 @@
         </w:rPr>
         <w:t>Regulación legislativa basada en las normativas actuales.</w:t>
       </w:r>
+      <w:r>
+        <w:rPr>
+          <w:lang w:val="es-419" w:eastAsia="es-CO"/>
+        </w:rPr>
+        <w:t xml:space="preserve"> </w:t>
+      </w:r>
+      <w:r>
+        <w:rPr>
+          <w:lang w:val="es-419" w:eastAsia="es-CO"/>
+        </w:rPr>
+        <w:t>Consiste en la aplicación de las leyes vigentes al entorno digital, mediante normas que regulan las transacciones electrónicas, protegen los derechos de consumidores y proveedores, y establecen responsabilidades para los actores que participan en el comercio electrónico.</w:t>
+      </w:r>
     </w:p>
     <w:p>
       <w:pPr>
         <w:pStyle w:val="Ttulo2"/>
       </w:pPr>
-      <w:bookmarkStart w:id="12" w:name="_Toc232584235"/>
+      <w:bookmarkStart w:id="12" w:name="_Toc234503627"/>
       <w:r>
         <w:t>Normatividad del comercio electrónico</w:t>
       </w:r>
@@ -7149,8 +7275,17 @@
           <w:rStyle w:val="Extranjerismo"/>
           <w:lang w:val="es-419" w:eastAsia="es-CO"/>
         </w:rPr>
-        <w:t>e-commerce</w:t>
-      </w:r>
+        <w:t>e-</w:t>
+      </w:r>
+      <w:proofErr w:type="spellStart"/>
+      <w:r>
+        <w:rPr>
+          <w:rStyle w:val="Extranjerismo"/>
+          <w:lang w:val="es-419" w:eastAsia="es-CO"/>
+        </w:rPr>
+        <w:t>commerce</w:t>
+      </w:r>
+      <w:proofErr w:type="spellEnd"/>
       <w:r>
         <w:rPr>
           <w:lang w:val="es-419" w:eastAsia="es-CO"/>
@@ -7215,27 +7350,27 @@
         <w:rPr>
           <w:lang w:val="es-419" w:eastAsia="es-CO"/>
         </w:rPr>
-        <w:t>Reglamenta parcialmente la Ley 527 de 1999 en lo relacionado con las entidades de certificación, los certificados y las firmas digitales. Está fundamentado en principios internacionales aplicables al comercio electrónico y actualiza el régimen jurídico de certificación digital en Colombia.</w:t>
-      </w:r>
-    </w:p>
-    <w:p>
-      <w:pPr>
-        <w:rPr>
-          <w:lang w:val="es-419" w:eastAsia="es-CO"/>
-        </w:rPr>
-      </w:pPr>
-      <w:r>
-        <w:rPr>
-          <w:lang w:val="es-419" w:eastAsia="es-CO"/>
-        </w:rPr>
-        <w:t xml:space="preserve">Aunque no regula de manera específica la protección al consumidor, esta materia se encuentra desarrollada en la Ley 1480 de 2011 (Estatuto del Consumidor), la cual </w:t>
+        <w:t xml:space="preserve">Reglamenta parcialmente la Ley 527 de 1999 en lo relacionado con las entidades de certificación, los certificados y las firmas digitales. Está fundamentado en principios </w:t>
       </w:r>
       <w:r>
         <w:rPr>
           <w:lang w:val="es-419" w:eastAsia="es-CO"/>
         </w:rPr>
         <w:lastRenderedPageBreak/>
-        <w:t>protege los derechos de los consumidores y establece disposiciones aplicables a las transacciones realizadas mediante comercio electrónico.</w:t>
+        <w:t>internacionales aplicables al comercio electrónico y actualiza el régimen jurídico de certificación digital en Colombia.</w:t>
+      </w:r>
+    </w:p>
+    <w:p>
+      <w:pPr>
+        <w:rPr>
+          <w:lang w:val="es-419" w:eastAsia="es-CO"/>
+        </w:rPr>
+      </w:pPr>
+      <w:r>
+        <w:rPr>
+          <w:lang w:val="es-419" w:eastAsia="es-CO"/>
+        </w:rPr>
+        <w:t>Aunque no regula de manera específica la protección al consumidor, esta materia se encuentra desarrollada en la Ley 1480 de 2011 (Estatuto del Consumidor), la cual protege los derechos de los consumidores y establece disposiciones aplicables a las transacciones realizadas mediante comercio electrónico.</w:t>
       </w:r>
     </w:p>
     <w:p>
@@ -7309,6 +7444,7 @@
         <w:rPr>
           <w:lang w:val="es-419" w:eastAsia="es-CO"/>
         </w:rPr>
+        <w:lastRenderedPageBreak/>
         <w:t>Bajos niveles de seguridad.</w:t>
       </w:r>
     </w:p>
@@ -7327,14 +7463,7 @@
         <w:rPr>
           <w:lang w:val="es-419" w:eastAsia="es-CO"/>
         </w:rPr>
-        <w:t xml:space="preserve">La firma electrónica y la firma digital cuentan con marco jurídico definido en la Ley 527 de 1999, el Decreto 2364 de 2012 y el Decreto 333 de 2014. De igual forma, la factura electrónica dispone de regulación tributaria </w:t>
-      </w:r>
-      <w:r>
-        <w:rPr>
-          <w:lang w:val="es-419" w:eastAsia="es-CO"/>
-        </w:rPr>
-        <w:lastRenderedPageBreak/>
-        <w:t>específica, entre otras normas, el Decreto 358 de 2020 y la Resolución DIAN 000165 de 2023, junto con sus modificaciones posteriores.</w:t>
+        <w:t>La firma electrónica y la firma digital cuentan con marco jurídico definido en la Ley 527 de 1999, el Decreto 2364 de 2012 y el Decreto 333 de 2014. De igual forma, la factura electrónica dispone de regulación tributaria específica, entre otras normas, el Decreto 358 de 2020 y la Resolución DIAN 000165 de 2023, junto con sus modificaciones posteriores.</w:t>
       </w:r>
     </w:p>
     <w:p>
@@ -7390,8 +7519,17 @@
           <w:rStyle w:val="Extranjerismo"/>
           <w:lang w:val="es-419" w:eastAsia="es-CO"/>
         </w:rPr>
-        <w:t>e-commerce</w:t>
-      </w:r>
+        <w:t>e-</w:t>
+      </w:r>
+      <w:proofErr w:type="spellStart"/>
+      <w:r>
+        <w:rPr>
+          <w:rStyle w:val="Extranjerismo"/>
+          <w:lang w:val="es-419" w:eastAsia="es-CO"/>
+        </w:rPr>
+        <w:t>commerce</w:t>
+      </w:r>
+      <w:proofErr w:type="spellEnd"/>
       <w:r>
         <w:rPr>
           <w:lang w:val="es-419" w:eastAsia="es-CO"/>
@@ -7410,7 +7548,7 @@
       <w:pPr>
         <w:pStyle w:val="Titulosgenerales"/>
       </w:pPr>
-      <w:bookmarkStart w:id="13" w:name="_Toc232584236"/>
+      <w:bookmarkStart w:id="13" w:name="_Toc234503628"/>
       <w:r>
         <w:lastRenderedPageBreak/>
         <w:t>S</w:t>
@@ -7514,7 +7652,7 @@
       <w:pPr>
         <w:pStyle w:val="Titulosgenerales"/>
       </w:pPr>
-      <w:bookmarkStart w:id="14" w:name="_Toc232584237"/>
+      <w:bookmarkStart w:id="14" w:name="_Toc234503629"/>
       <w:r>
         <w:lastRenderedPageBreak/>
         <w:t>Glosario</w:t>
@@ -7527,7 +7665,23 @@
           <w:b/>
           <w:bCs/>
         </w:rPr>
-        <w:t>AMA (American Marketing Association)</w:t>
+        <w:t xml:space="preserve">AMA (American Marketing </w:t>
+      </w:r>
+      <w:proofErr w:type="spellStart"/>
+      <w:r>
+        <w:rPr>
+          <w:b/>
+          <w:bCs/>
+        </w:rPr>
+        <w:t>Association</w:t>
+      </w:r>
+      <w:proofErr w:type="spellEnd"/>
+      <w:r>
+        <w:rPr>
+          <w:b/>
+          <w:bCs/>
+        </w:rPr>
+        <w:t>)</w:t>
       </w:r>
       <w:r>
         <w:t xml:space="preserve">: organización de origen estadounidense que agrupa a los profesionales y educadores del </w:t>
@@ -7594,7 +7748,7 @@
       <w:pPr>
         <w:pStyle w:val="Titulosgenerales"/>
       </w:pPr>
-      <w:bookmarkStart w:id="15" w:name="_Toc232584238"/>
+      <w:bookmarkStart w:id="15" w:name="_Toc234503630"/>
       <w:r>
         <w:lastRenderedPageBreak/>
         <w:t>Referencias bibliográficas</w:t>
@@ -7606,7 +7760,15 @@
     </w:p>
     <w:p>
       <w:r>
-        <w:t xml:space="preserve">American Marketing Association. (2020, 3 de diciembre). </w:t>
+        <w:t xml:space="preserve">American Marketing </w:t>
+      </w:r>
+      <w:proofErr w:type="spellStart"/>
+      <w:r>
+        <w:t>Association</w:t>
+      </w:r>
+      <w:proofErr w:type="spellEnd"/>
+      <w:r>
+        <w:t xml:space="preserve">. (2020, 3 de diciembre). </w:t>
       </w:r>
       <w:r>
         <w:rPr>
@@ -7740,65 +7902,54 @@
       <w:r>
         <w:t xml:space="preserve"> [Tesis de maestría, Instituto Politécnico Nacional]. Repositorio Nacional. </w:t>
       </w:r>
+    </w:p>
+    <w:p>
+      <w:r>
+        <w:t xml:space="preserve">Kotler, P., y Armstrong, G. (2013). Fundamentos de </w:t>
+      </w:r>
+      <w:r>
+        <w:rPr>
+          <w:rStyle w:val="Extranjerismo"/>
+        </w:rPr>
+        <w:t>marketing</w:t>
+      </w:r>
+      <w:r>
+        <w:t xml:space="preserve"> (11.ª ed.). Pearson Educación.</w:t>
+      </w:r>
+    </w:p>
+    <w:p>
+      <w:r>
+        <w:t xml:space="preserve">Kotler, P., y Keller, K. L. (2013). Dirección de </w:t>
+      </w:r>
+      <w:r>
+        <w:rPr>
+          <w:rStyle w:val="Extranjerismo"/>
+        </w:rPr>
+        <w:t>marketing</w:t>
+      </w:r>
+      <w:r>
+        <w:t>. Pearson Educación.</w:t>
+      </w:r>
+    </w:p>
+    <w:p>
+      <w:r>
+        <w:t xml:space="preserve">Lamb, C. W., Hair, J. F., y McDaniel, C. (2011). </w:t>
+      </w:r>
+      <w:r>
+        <w:rPr>
+          <w:rStyle w:val="Extranjerismo"/>
+        </w:rPr>
+        <w:t>Marketing. Cengage Learning</w:t>
+      </w:r>
+      <w:r>
+        <w:t>.</w:t>
+      </w:r>
+    </w:p>
+    <w:p>
+      <w:r>
+        <w:t xml:space="preserve">Ministerio de Comercio, Industria y Turismo. (2015, 26 de mayo). Decreto 1074 de 2015. Por medio del cual se expide el Decreto Único Reglamentario del Sector Comercio, Industria y Turismo. Diario Oficial. </w:t>
+      </w:r>
       <w:hyperlink r:id="rId26" w:history="1">
-        <w:r>
-          <w:rPr>
-            <w:rStyle w:val="Hipervnculo"/>
-          </w:rPr>
-          <w:t>https://www.repositorionacionalcti.mx/</w:t>
-        </w:r>
-      </w:hyperlink>
-      <w:r>
-        <w:t xml:space="preserve"> </w:t>
-      </w:r>
-    </w:p>
-    <w:p>
-      <w:r>
-        <w:t xml:space="preserve">Kotler, P., y Armstrong, G. (2013). Fundamentos de </w:t>
-      </w:r>
-      <w:r>
-        <w:rPr>
-          <w:rStyle w:val="Extranjerismo"/>
-        </w:rPr>
-        <w:t>marketing</w:t>
-      </w:r>
-      <w:r>
-        <w:t xml:space="preserve"> (11.ª ed.). Pearson Educación.</w:t>
-      </w:r>
-    </w:p>
-    <w:p>
-      <w:r>
-        <w:t xml:space="preserve">Kotler, P., y Keller, K. L. (2013). Dirección de </w:t>
-      </w:r>
-      <w:r>
-        <w:rPr>
-          <w:rStyle w:val="Extranjerismo"/>
-        </w:rPr>
-        <w:t>marketing</w:t>
-      </w:r>
-      <w:r>
-        <w:t>. Pearson Educación.</w:t>
-      </w:r>
-    </w:p>
-    <w:p>
-      <w:r>
-        <w:t xml:space="preserve">Lamb, C. W., Hair, J. F., y McDaniel, C. (2011). </w:t>
-      </w:r>
-      <w:r>
-        <w:rPr>
-          <w:rStyle w:val="Extranjerismo"/>
-        </w:rPr>
-        <w:t>Marketing. Cengage Learning</w:t>
-      </w:r>
-      <w:r>
-        <w:t>.</w:t>
-      </w:r>
-    </w:p>
-    <w:p>
-      <w:r>
-        <w:t xml:space="preserve">Ministerio de Comercio, Industria y Turismo. (2015, 26 de mayo). Decreto 1074 de 2015. Por medio del cual se expide el Decreto Único Reglamentario del Sector Comercio, Industria y Turismo. Diario Oficial. </w:t>
-      </w:r>
-      <w:hyperlink r:id="rId27" w:history="1">
         <w:r>
           <w:rPr>
             <w:rStyle w:val="Hipervnculo"/>
@@ -7819,7 +7970,7 @@
       <w:r>
         <w:t xml:space="preserve">Presidencia de la República de Colombia. (2012, 22 de noviembre). Decreto 2364 de 2012. Por medio del cual se reglamenta el artículo 7 de la Ley 527 de 1999 sobre la firma electrónica y se dictan otras disposiciones. Diario Oficial. </w:t>
       </w:r>
-      <w:hyperlink r:id="rId28" w:history="1">
+      <w:hyperlink r:id="rId27" w:history="1">
         <w:r>
           <w:rPr>
             <w:rStyle w:val="Hipervnculo"/>
@@ -7836,7 +7987,7 @@
         <w:lastRenderedPageBreak/>
         <w:t xml:space="preserve">Presidencia de la República de Colombia. (2014, 19 de febrero). Decreto 333 de 2014. Por el cual se reglamenta parcialmente la Ley 527 de 1999 en lo relacionado con las entidades de certificación, los certificados y las firmas digitales. Diario Oficial. </w:t>
       </w:r>
-      <w:hyperlink r:id="rId29" w:history="1">
+      <w:hyperlink r:id="rId28" w:history="1">
         <w:r>
           <w:rPr>
             <w:rStyle w:val="Hipervnculo"/>
@@ -7852,7 +8003,7 @@
       <w:r>
         <w:t xml:space="preserve">Presidencia de la República de Colombia. (2020, 5 de marzo). Decreto 358 de 2020. Por el cual se reglamentan disposiciones en materia tributaria relacionadas con los sistemas de facturación. Diario Oficial. </w:t>
       </w:r>
-      <w:hyperlink r:id="rId30" w:history="1">
+      <w:hyperlink r:id="rId29" w:history="1">
         <w:r>
           <w:rPr>
             <w:rStyle w:val="Hipervnculo"/>
@@ -7892,7 +8043,7 @@
       <w:r>
         <w:t xml:space="preserve">Silva, R. (2009). Beneficios del comercio electrónico. Perspectivas, 24, 151–164. </w:t>
       </w:r>
-      <w:hyperlink r:id="rId31" w:history="1">
+      <w:hyperlink r:id="rId30" w:history="1">
         <w:r>
           <w:rPr>
             <w:rStyle w:val="Hipervnculo"/>
@@ -7957,7 +8108,7 @@
       <w:pPr>
         <w:pStyle w:val="Titulosgenerales"/>
       </w:pPr>
-      <w:bookmarkStart w:id="16" w:name="_Toc232584239"/>
+      <w:bookmarkStart w:id="16" w:name="_Toc234503631"/>
       <w:r>
         <w:lastRenderedPageBreak/>
         <w:t>Créditos</w:t>
@@ -8237,7 +8388,35 @@
                 <w:rFonts w:cs="Calibri"/>
                 <w:szCs w:val="24"/>
               </w:rPr>
-              <w:t>Centro Industrial del Diseño y la Manufactura Regional - Santander</w:t>
+              <w:t>Centro Industrial del Diseño y la Manufactura</w:t>
+            </w:r>
+            <w:r>
+              <w:rPr>
+                <w:rFonts w:cs="Calibri"/>
+                <w:szCs w:val="24"/>
+              </w:rPr>
+              <w:t xml:space="preserve"> -</w:t>
+            </w:r>
+            <w:r>
+              <w:rPr>
+                <w:rFonts w:cs="Calibri"/>
+                <w:szCs w:val="24"/>
+              </w:rPr>
+              <w:t xml:space="preserve"> Regional</w:t>
+            </w:r>
+            <w:r>
+              <w:rPr>
+                <w:rFonts w:cs="Calibri"/>
+                <w:szCs w:val="24"/>
+              </w:rPr>
+              <w:t xml:space="preserve"> </w:t>
+            </w:r>
+            <w:r>
+              <w:rPr>
+                <w:rFonts w:cs="Calibri"/>
+                <w:szCs w:val="24"/>
+              </w:rPr>
+              <w:t>Santander</w:t>
             </w:r>
           </w:p>
         </w:tc>
@@ -8255,8 +8434,13 @@
                 <w:szCs w:val="24"/>
               </w:rPr>
             </w:pPr>
-            <w:r>
-              <w:t>Maria Camila Álvarez</w:t>
+            <w:proofErr w:type="spellStart"/>
+            <w:r>
+              <w:t>Maria</w:t>
+            </w:r>
+            <w:proofErr w:type="spellEnd"/>
+            <w:r>
+              <w:t xml:space="preserve"> Camila Álvarez</w:t>
             </w:r>
           </w:p>
         </w:tc>
@@ -8296,7 +8480,13 @@
               </w:rPr>
             </w:pPr>
             <w:r>
-              <w:t>Centro de Formación en Diseño, Confección y Moda Regional - Antioquia</w:t>
+              <w:t>Centro de Formación en Diseño, Confección y Moda</w:t>
+            </w:r>
+            <w:r>
+              <w:t xml:space="preserve"> -</w:t>
+            </w:r>
+            <w:r>
+              <w:t xml:space="preserve"> Regional Antioquia</w:t>
             </w:r>
           </w:p>
         </w:tc>
@@ -8312,17 +8502,9 @@
           <w:p>
             <w:pPr>
               <w:pStyle w:val="TextoTablas"/>
-              <w:rPr>
-                <w:rFonts w:cs="Calibri"/>
-                <w:szCs w:val="24"/>
-              </w:rPr>
             </w:pPr>
             <w:r>
-              <w:rPr>
-                <w:rFonts w:cs="Calibri"/>
-                <w:szCs w:val="24"/>
-              </w:rPr>
-              <w:t>Liliana Ceballos</w:t>
+              <w:t>Andrés Felipe Velandia Espitia</w:t>
             </w:r>
           </w:p>
         </w:tc>
@@ -8333,31 +8515,9 @@
           <w:p>
             <w:pPr>
               <w:pStyle w:val="TextoTablas"/>
-              <w:rPr>
-                <w:rFonts w:cs="Calibri"/>
-                <w:szCs w:val="24"/>
-              </w:rPr>
             </w:pPr>
             <w:r>
-              <w:rPr>
-                <w:rFonts w:cs="Calibri"/>
-                <w:szCs w:val="24"/>
-              </w:rPr>
-              <w:t xml:space="preserve">Contratista diseño </w:t>
-            </w:r>
-            <w:r>
-              <w:rPr>
-                <w:rFonts w:cs="Calibri"/>
-                <w:szCs w:val="24"/>
-              </w:rPr>
-              <w:t>c</w:t>
-            </w:r>
-            <w:r>
-              <w:rPr>
-                <w:rFonts w:cs="Calibri"/>
-                <w:szCs w:val="24"/>
-              </w:rPr>
-              <w:t>urricular</w:t>
+              <w:t>Revisor metodológico y pedagógico</w:t>
             </w:r>
           </w:p>
         </w:tc>
@@ -8368,17 +8528,9 @@
           <w:p>
             <w:pPr>
               <w:pStyle w:val="TextoTablas"/>
-              <w:rPr>
-                <w:rFonts w:cs="Calibri"/>
-                <w:szCs w:val="24"/>
-              </w:rPr>
             </w:pPr>
             <w:r>
-              <w:rPr>
-                <w:rFonts w:cs="Calibri"/>
-                <w:szCs w:val="24"/>
-              </w:rPr>
-              <w:t>Centro de Formación en Diseño, Confección y Moda Regional - Antioquia</w:t>
+              <w:t>Centro de Diseño Y Metrología – Regional Distrito Capital</w:t>
             </w:r>
           </w:p>
         </w:tc>
@@ -8391,13 +8543,9 @@
           <w:p>
             <w:pPr>
               <w:pStyle w:val="TextoTablas"/>
-              <w:rPr>
-                <w:rFonts w:cs="Calibri"/>
-                <w:szCs w:val="24"/>
-              </w:rPr>
             </w:pPr>
             <w:r>
-              <w:t>Cristian Metaute Medina</w:t>
+              <w:t>Uriel Darío González Montoya</w:t>
             </w:r>
           </w:p>
         </w:tc>
@@ -8408,13 +8556,9 @@
           <w:p>
             <w:pPr>
               <w:pStyle w:val="TextoTablas"/>
-              <w:rPr>
-                <w:rFonts w:cs="Calibri"/>
-                <w:szCs w:val="24"/>
-              </w:rPr>
             </w:pPr>
             <w:r>
-              <w:t>Diseñador instruccional</w:t>
+              <w:t>Acompañamiento pedagógico</w:t>
             </w:r>
           </w:p>
         </w:tc>
@@ -8425,13 +8569,9 @@
           <w:p>
             <w:pPr>
               <w:pStyle w:val="TextoTablas"/>
-              <w:rPr>
-                <w:rFonts w:cs="Calibri"/>
-                <w:szCs w:val="24"/>
-              </w:rPr>
             </w:pPr>
             <w:r>
-              <w:t>Centro Industrial del Diseño y la Manufactura Regional - Santander</w:t>
+              <w:t>Uriel Darío González Montoya</w:t>
             </w:r>
           </w:p>
         </w:tc>
@@ -8453,7 +8593,11 @@
               </w:rPr>
             </w:pPr>
             <w:r>
-              <w:t>Andrés Felipe Herrera Roldan</w:t>
+              <w:rPr>
+                <w:rFonts w:cs="Calibri"/>
+                <w:szCs w:val="24"/>
+              </w:rPr>
+              <w:t>Liliana Ceballos</w:t>
             </w:r>
           </w:p>
         </w:tc>
@@ -8470,7 +8614,25 @@
               </w:rPr>
             </w:pPr>
             <w:r>
-              <w:t xml:space="preserve">Diseñador web </w:t>
+              <w:rPr>
+                <w:rFonts w:cs="Calibri"/>
+                <w:szCs w:val="24"/>
+              </w:rPr>
+              <w:t xml:space="preserve">Contratista diseño </w:t>
+            </w:r>
+            <w:r>
+              <w:rPr>
+                <w:rFonts w:cs="Calibri"/>
+                <w:szCs w:val="24"/>
+              </w:rPr>
+              <w:t>c</w:t>
+            </w:r>
+            <w:r>
+              <w:rPr>
+                <w:rFonts w:cs="Calibri"/>
+                <w:szCs w:val="24"/>
+              </w:rPr>
+              <w:t>urricular</w:t>
             </w:r>
           </w:p>
         </w:tc>
@@ -8487,7 +8649,25 @@
               </w:rPr>
             </w:pPr>
             <w:r>
-              <w:t>Centro de Comercio y Servicios – Regional Atlántico</w:t>
+              <w:rPr>
+                <w:rFonts w:cs="Calibri"/>
+                <w:szCs w:val="24"/>
+              </w:rPr>
+              <w:t xml:space="preserve">Centro de Formación en Diseño, Confección y Moda </w:t>
+            </w:r>
+            <w:r>
+              <w:rPr>
+                <w:rFonts w:cs="Calibri"/>
+                <w:szCs w:val="24"/>
+              </w:rPr>
+              <w:t xml:space="preserve">- </w:t>
+            </w:r>
+            <w:r>
+              <w:rPr>
+                <w:rFonts w:cs="Calibri"/>
+                <w:szCs w:val="24"/>
+              </w:rPr>
+              <w:t>Regional Antioquia</w:t>
             </w:r>
           </w:p>
         </w:tc>
@@ -8506,7 +8686,7 @@
               </w:rPr>
             </w:pPr>
             <w:r>
-              <w:t>Fabio Fonseca Arguelles</w:t>
+              <w:t>Cristian Metaute Medina</w:t>
             </w:r>
           </w:p>
         </w:tc>
@@ -8523,13 +8703,7 @@
               </w:rPr>
             </w:pPr>
             <w:r>
-              <w:t xml:space="preserve">Desarrollador </w:t>
-            </w:r>
-            <w:r>
-              <w:rPr>
-                <w:rStyle w:val="Extranjerismo"/>
-              </w:rPr>
-              <w:t>full stack</w:t>
+              <w:t>Diseñador instruccional</w:t>
             </w:r>
           </w:p>
         </w:tc>
@@ -8546,7 +8720,13 @@
               </w:rPr>
             </w:pPr>
             <w:r>
-              <w:t>Centro de Comercio y Servicios – Regional Atlántico</w:t>
+              <w:t>Centro Industrial del Diseño y la Manufactura</w:t>
+            </w:r>
+            <w:r>
+              <w:t xml:space="preserve"> -</w:t>
+            </w:r>
+            <w:r>
+              <w:t xml:space="preserve"> Regional Santander</w:t>
             </w:r>
           </w:p>
         </w:tc>
@@ -8568,7 +8748,7 @@
               </w:rPr>
             </w:pPr>
             <w:r>
-              <w:t>Nelson Iván Vera Briceño</w:t>
+              <w:t>Andrés Felipe Herrera Roldan</w:t>
             </w:r>
           </w:p>
         </w:tc>
@@ -8585,7 +8765,7 @@
               </w:rPr>
             </w:pPr>
             <w:r>
-              <w:t xml:space="preserve">Animador y productor audiovisual </w:t>
+              <w:t xml:space="preserve">Diseñador web </w:t>
             </w:r>
           </w:p>
         </w:tc>
@@ -8602,7 +8782,13 @@
               </w:rPr>
             </w:pPr>
             <w:r>
-              <w:t>Centro de Comercio y Servicios – Regional Atlántico</w:t>
+              <w:t>Centro de Comercio y Servicios</w:t>
+            </w:r>
+            <w:r>
+              <w:t xml:space="preserve"> -</w:t>
+            </w:r>
+            <w:r>
+              <w:t xml:space="preserve"> Regional Atlántico</w:t>
             </w:r>
           </w:p>
         </w:tc>
@@ -8621,7 +8807,7 @@
               </w:rPr>
             </w:pPr>
             <w:r>
-              <w:t>Zuleidy María Ruíz Torres</w:t>
+              <w:t>Fabio Fonseca Arguelles</w:t>
             </w:r>
           </w:p>
         </w:tc>
@@ -8638,7 +8824,13 @@
               </w:rPr>
             </w:pPr>
             <w:r>
-              <w:t>Producción audiovisual</w:t>
+              <w:t xml:space="preserve">Desarrollador </w:t>
+            </w:r>
+            <w:r>
+              <w:rPr>
+                <w:rStyle w:val="Extranjerismo"/>
+              </w:rPr>
+              <w:t>full stack</w:t>
             </w:r>
           </w:p>
         </w:tc>
@@ -8655,7 +8847,13 @@
               </w:rPr>
             </w:pPr>
             <w:r>
-              <w:t>Centro de Comercio y Servicios Regional - Tolima</w:t>
+              <w:t xml:space="preserve">Centro de Comercio y Servicios </w:t>
+            </w:r>
+            <w:r>
+              <w:t>-</w:t>
+            </w:r>
+            <w:r>
+              <w:t xml:space="preserve"> Regional Atlántico</w:t>
             </w:r>
           </w:p>
         </w:tc>
@@ -8677,7 +8875,7 @@
               </w:rPr>
             </w:pPr>
             <w:r>
-              <w:t>Wilson Andrés Arenales Cáceres</w:t>
+              <w:t>Nelson Iván Vera Briceño</w:t>
             </w:r>
           </w:p>
         </w:tc>
@@ -8694,7 +8892,7 @@
               </w:rPr>
             </w:pPr>
             <w:r>
-              <w:t>Producción audiovisual</w:t>
+              <w:t xml:space="preserve">Animador y productor audiovisual </w:t>
             </w:r>
           </w:p>
         </w:tc>
@@ -8711,7 +8909,13 @@
               </w:rPr>
             </w:pPr>
             <w:r>
-              <w:t>Centro Industrial del Diseño y la Manufactura Regional - Santander</w:t>
+              <w:t xml:space="preserve">Centro de Comercio y Servicios </w:t>
+            </w:r>
+            <w:r>
+              <w:t>-</w:t>
+            </w:r>
+            <w:r>
+              <w:t xml:space="preserve"> Regional Atlántico</w:t>
             </w:r>
           </w:p>
         </w:tc>
@@ -8731,7 +8935,7 @@
             </w:pPr>
             <w:r>
               <w:lastRenderedPageBreak/>
-              <w:t>Gilberto Junior Rodríguez Rodríguez</w:t>
+              <w:t>Zuleidy María Ruíz Torres</w:t>
             </w:r>
           </w:p>
         </w:tc>
@@ -8765,7 +8969,13 @@
               </w:rPr>
             </w:pPr>
             <w:r>
-              <w:t>Centro Industrial del Diseño y la Manufactura Regional - Santander</w:t>
+              <w:t xml:space="preserve">Centro de Comercio y Servicios </w:t>
+            </w:r>
+            <w:r>
+              <w:t xml:space="preserve">- </w:t>
+            </w:r>
+            <w:r>
+              <w:t>Regional Tolima</w:t>
             </w:r>
           </w:p>
         </w:tc>
@@ -8787,7 +8997,7 @@
               </w:rPr>
             </w:pPr>
             <w:r>
-              <w:t>Víctor Cardenas</w:t>
+              <w:t>Wilson Andrés Arenales Cáceres</w:t>
             </w:r>
           </w:p>
         </w:tc>
@@ -8821,7 +9031,13 @@
               </w:rPr>
             </w:pPr>
             <w:r>
-              <w:t>Centro Industrial del Diseño y la Manufactura Regional - Santander</w:t>
+              <w:t xml:space="preserve">Centro Industrial del Diseño y la Manufactura </w:t>
+            </w:r>
+            <w:r>
+              <w:t xml:space="preserve">- </w:t>
+            </w:r>
+            <w:r>
+              <w:t>Regional Santander</w:t>
             </w:r>
           </w:p>
         </w:tc>
@@ -8840,8 +9056,13 @@
               </w:rPr>
             </w:pPr>
             <w:r>
-              <w:t>Camilo Villamizar</w:t>
-            </w:r>
+              <w:t xml:space="preserve">Gilberto Junior Rodríguez </w:t>
+            </w:r>
+            <w:proofErr w:type="spellStart"/>
+            <w:r>
+              <w:t>Rodríguez</w:t>
+            </w:r>
+            <w:proofErr w:type="spellEnd"/>
           </w:p>
         </w:tc>
         <w:tc>
@@ -8874,7 +9095,13 @@
               </w:rPr>
             </w:pPr>
             <w:r>
-              <w:t>Centro Industrial del Diseño y la Manufactura Regional - Santander</w:t>
+              <w:t xml:space="preserve">Centro Industrial del Diseño y la Manufactura </w:t>
+            </w:r>
+            <w:r>
+              <w:t xml:space="preserve">- </w:t>
+            </w:r>
+            <w:r>
+              <w:t>Regional Santander</w:t>
             </w:r>
           </w:p>
         </w:tc>
@@ -8896,7 +9123,7 @@
               </w:rPr>
             </w:pPr>
             <w:r>
-              <w:t>Ludwyng Corzo</w:t>
+              <w:t>Víctor Cardenas</w:t>
             </w:r>
           </w:p>
         </w:tc>
@@ -8930,7 +9157,13 @@
               </w:rPr>
             </w:pPr>
             <w:r>
-              <w:t>Centro Industrial del Diseño y la Manufactura Regional - Santander</w:t>
+              <w:t xml:space="preserve">Centro Industrial del Diseño y la Manufactura </w:t>
+            </w:r>
+            <w:r>
+              <w:t xml:space="preserve">- </w:t>
+            </w:r>
+            <w:r>
+              <w:t>Regional Santander</w:t>
             </w:r>
           </w:p>
         </w:tc>
@@ -8949,7 +9182,7 @@
               </w:rPr>
             </w:pPr>
             <w:r>
-              <w:t>Luz Karime Amaya Cabra</w:t>
+              <w:t>Camilo Villamizar</w:t>
             </w:r>
           </w:p>
         </w:tc>
@@ -8966,7 +9199,7 @@
               </w:rPr>
             </w:pPr>
             <w:r>
-              <w:t xml:space="preserve">Evaluador de contenidos inclusivos y accesibles </w:t>
+              <w:t>Producción audiovisual</w:t>
             </w:r>
           </w:p>
         </w:tc>
@@ -8983,7 +9216,13 @@
               </w:rPr>
             </w:pPr>
             <w:r>
-              <w:t>Centro de Comercio y Servicios – Regional Atlántico</w:t>
+              <w:t xml:space="preserve">Centro Industrial del Diseño y la Manufactura </w:t>
+            </w:r>
+            <w:r>
+              <w:t xml:space="preserve">- </w:t>
+            </w:r>
+            <w:r>
+              <w:t>Regional Santander</w:t>
             </w:r>
           </w:p>
         </w:tc>
@@ -9004,8 +9243,13 @@
                 <w:szCs w:val="24"/>
               </w:rPr>
             </w:pPr>
-            <w:r>
-              <w:t>Laura Daniela Burgos Rueda</w:t>
+            <w:proofErr w:type="spellStart"/>
+            <w:r>
+              <w:t>Ludwyng</w:t>
+            </w:r>
+            <w:proofErr w:type="spellEnd"/>
+            <w:r>
+              <w:t xml:space="preserve"> Corzo</w:t>
             </w:r>
           </w:p>
         </w:tc>
@@ -9022,7 +9266,7 @@
               </w:rPr>
             </w:pPr>
             <w:r>
-              <w:t xml:space="preserve">Evaluador de contenidos inclusivos y accesibles </w:t>
+              <w:t>Producción audiovisual</w:t>
             </w:r>
           </w:p>
         </w:tc>
@@ -9039,7 +9283,13 @@
               </w:rPr>
             </w:pPr>
             <w:r>
-              <w:t>Centro de Comercio y Servicios – Regional Atlántico</w:t>
+              <w:t xml:space="preserve">Centro Industrial del Diseño y la Manufactura </w:t>
+            </w:r>
+            <w:r>
+              <w:t xml:space="preserve">- </w:t>
+            </w:r>
+            <w:r>
+              <w:t>Regional Santander</w:t>
             </w:r>
           </w:p>
         </w:tc>
@@ -9058,11 +9308,7 @@
               </w:rPr>
             </w:pPr>
             <w:r>
-              <w:rPr>
-                <w:rFonts w:cs="Calibri"/>
-                <w:szCs w:val="24"/>
-              </w:rPr>
-              <w:t>Jonathan Adié Villafañe</w:t>
+              <w:t>Luz Karime Amaya Cabra</w:t>
             </w:r>
           </w:p>
         </w:tc>
@@ -9079,7 +9325,7 @@
               </w:rPr>
             </w:pPr>
             <w:r>
-              <w:t>Validador y vinculador de recursos digitales</w:t>
+              <w:t xml:space="preserve">Evaluador de contenidos inclusivos y accesibles </w:t>
             </w:r>
           </w:p>
         </w:tc>
@@ -9096,7 +9342,13 @@
               </w:rPr>
             </w:pPr>
             <w:r>
-              <w:t>Centro de Comercio y Servicios – Regional Atlántico</w:t>
+              <w:t xml:space="preserve">Centro de Comercio y Servicios </w:t>
+            </w:r>
+            <w:r>
+              <w:t>-</w:t>
+            </w:r>
+            <w:r>
+              <w:t>Regional Atlántico</w:t>
             </w:r>
           </w:p>
         </w:tc>
@@ -9118,7 +9370,7 @@
               </w:rPr>
             </w:pPr>
             <w:r>
-              <w:t>Karine Isabel Ospino Fritz</w:t>
+              <w:t>Laura Daniela Burgos Rueda</w:t>
             </w:r>
           </w:p>
         </w:tc>
@@ -9135,7 +9387,7 @@
               </w:rPr>
             </w:pPr>
             <w:r>
-              <w:t xml:space="preserve">Validador y vinculador de recursos digitales </w:t>
+              <w:t xml:space="preserve">Evaluador de contenidos inclusivos y accesibles </w:t>
             </w:r>
           </w:p>
         </w:tc>
@@ -9152,7 +9404,138 @@
               </w:rPr>
             </w:pPr>
             <w:r>
-              <w:t>Centro de Comercio y Servicios – Regional Atlántico</w:t>
+              <w:t xml:space="preserve">Centro de Comercio y Servicios </w:t>
+            </w:r>
+            <w:r>
+              <w:t>-</w:t>
+            </w:r>
+            <w:r>
+              <w:t>Regional Atlántico</w:t>
+            </w:r>
+          </w:p>
+        </w:tc>
+      </w:tr>
+      <w:tr>
+        <w:tc>
+          <w:tcPr>
+            <w:tcW w:w="2830" w:type="dxa"/>
+          </w:tcPr>
+          <w:p>
+            <w:pPr>
+              <w:pStyle w:val="TextoTablas"/>
+              <w:rPr>
+                <w:rFonts w:cs="Calibri"/>
+                <w:szCs w:val="24"/>
+              </w:rPr>
+            </w:pPr>
+            <w:r>
+              <w:rPr>
+                <w:rFonts w:cs="Calibri"/>
+                <w:szCs w:val="24"/>
+              </w:rPr>
+              <w:t>Jonathan Adié Villafañe</w:t>
+            </w:r>
+          </w:p>
+        </w:tc>
+        <w:tc>
+          <w:tcPr>
+            <w:tcW w:w="3261" w:type="dxa"/>
+          </w:tcPr>
+          <w:p>
+            <w:pPr>
+              <w:pStyle w:val="TextoTablas"/>
+              <w:rPr>
+                <w:rFonts w:cs="Calibri"/>
+                <w:szCs w:val="24"/>
+              </w:rPr>
+            </w:pPr>
+            <w:r>
+              <w:t>Validador y vinculador de recursos digitales</w:t>
+            </w:r>
+          </w:p>
+        </w:tc>
+        <w:tc>
+          <w:tcPr>
+            <w:tcW w:w="3969" w:type="dxa"/>
+          </w:tcPr>
+          <w:p>
+            <w:pPr>
+              <w:pStyle w:val="TextoTablas"/>
+              <w:rPr>
+                <w:rFonts w:cs="Calibri"/>
+                <w:szCs w:val="24"/>
+              </w:rPr>
+            </w:pPr>
+            <w:r>
+              <w:t xml:space="preserve">Centro de Comercio y Servicios </w:t>
+            </w:r>
+            <w:r>
+              <w:t>-</w:t>
+            </w:r>
+            <w:r>
+              <w:t>Regional Atlántico</w:t>
+            </w:r>
+          </w:p>
+        </w:tc>
+      </w:tr>
+      <w:tr>
+        <w:trPr>
+          <w:cnfStyle w:val="000000100000" w:firstRow="0" w:lastRow="0" w:firstColumn="0" w:lastColumn="0" w:oddVBand="0" w:evenVBand="0" w:oddHBand="1" w:evenHBand="0" w:firstRowFirstColumn="0" w:firstRowLastColumn="0" w:lastRowFirstColumn="0" w:lastRowLastColumn="0"/>
+        </w:trPr>
+        <w:tc>
+          <w:tcPr>
+            <w:tcW w:w="2830" w:type="dxa"/>
+          </w:tcPr>
+          <w:p>
+            <w:pPr>
+              <w:pStyle w:val="TextoTablas"/>
+              <w:rPr>
+                <w:rFonts w:cs="Calibri"/>
+                <w:szCs w:val="24"/>
+              </w:rPr>
+            </w:pPr>
+            <w:r>
+              <w:t>Karine Isabel Ospino Fritz</w:t>
+            </w:r>
+          </w:p>
+        </w:tc>
+        <w:tc>
+          <w:tcPr>
+            <w:tcW w:w="3261" w:type="dxa"/>
+          </w:tcPr>
+          <w:p>
+            <w:pPr>
+              <w:pStyle w:val="TextoTablas"/>
+              <w:rPr>
+                <w:rFonts w:cs="Calibri"/>
+                <w:szCs w:val="24"/>
+              </w:rPr>
+            </w:pPr>
+            <w:r>
+              <w:t xml:space="preserve">Validador y vinculador de recursos digitales </w:t>
+            </w:r>
+          </w:p>
+        </w:tc>
+        <w:tc>
+          <w:tcPr>
+            <w:tcW w:w="3969" w:type="dxa"/>
+          </w:tcPr>
+          <w:p>
+            <w:pPr>
+              <w:pStyle w:val="TextoTablas"/>
+              <w:rPr>
+                <w:rFonts w:cs="Calibri"/>
+                <w:szCs w:val="24"/>
+              </w:rPr>
+            </w:pPr>
+            <w:r>
+              <w:t xml:space="preserve">Centro de Comercio y Servicios </w:t>
+            </w:r>
+            <w:r>
+              <w:t>-</w:t>
+            </w:r>
+            <w:r>
+              <w:t>Regional Atlántico</w:t>
             </w:r>
           </w:p>
         </w:tc>
@@ -9160,8 +9543,8 @@
     </w:tbl>
     <w:p/>
     <w:sectPr>
-      <w:headerReference w:type="default" r:id="rId32"/>
-      <w:footerReference w:type="default" r:id="rId33"/>
+      <w:headerReference w:type="default" r:id="rId31"/>
+      <w:footerReference w:type="default" r:id="rId32"/>
       <w:pgSz w:w="12240" w:h="15840"/>
       <w:pgMar w:top="1701" w:right="1134" w:bottom="1134" w:left="1134" w:header="709" w:footer="737" w:gutter="0"/>
       <w:pgNumType w:start="1"/>
@@ -14290,8 +14673,8 @@
 </file>
 
 <file path=customXml/item1.xml><?xml version="1.0" encoding="utf-8"?>
-<ct:contentTypeSchema xmlns:ct="http://schemas.microsoft.com/office/2006/metadata/contentType" xmlns:ma="http://schemas.microsoft.com/office/2006/metadata/properties/metaAttributes" ct:_="" ma:_="" ma:contentTypeName="Documento" ma:contentTypeID="0x01010005252A1EF3BD024F856B47B579AB5244" ma:contentTypeVersion="11" ma:contentTypeDescription="Crear nuevo documento." ma:contentTypeScope="" ma:versionID="92b81066167b779aaeee7a3d91bad2fd">
-  <xsd:schema xmlns:xsd="http://www.w3.org/2001/XMLSchema" xmlns:xs="http://www.w3.org/2001/XMLSchema" xmlns:p="http://schemas.microsoft.com/office/2006/metadata/properties" xmlns:ns2="42760c81-fd8e-4d59-8953-7cdb9f38b14f" xmlns:ns3="67a0edcd-0de5-43ed-8c27-e32f38a00c91" targetNamespace="http://schemas.microsoft.com/office/2006/metadata/properties" ma:root="true" ma:fieldsID="83cd6766d967e870b9368cac1ade74e6" ns2:_="" ns3:_="">
+<ct:contentTypeSchema xmlns:ct="http://schemas.microsoft.com/office/2006/metadata/contentType" xmlns:ma="http://schemas.microsoft.com/office/2006/metadata/properties/metaAttributes" ct:_="" ma:_="" ma:contentTypeName="Documento" ma:contentTypeID="0x01010005252A1EF3BD024F856B47B579AB5244" ma:contentTypeVersion="12" ma:contentTypeDescription="Crear nuevo documento." ma:contentTypeScope="" ma:versionID="32d0e18b85ac20c34eab62df21c0cf58">
+  <xsd:schema xmlns:xsd="http://www.w3.org/2001/XMLSchema" xmlns:xs="http://www.w3.org/2001/XMLSchema" xmlns:p="http://schemas.microsoft.com/office/2006/metadata/properties" xmlns:ns2="42760c81-fd8e-4d59-8953-7cdb9f38b14f" xmlns:ns3="67a0edcd-0de5-43ed-8c27-e32f38a00c91" targetNamespace="http://schemas.microsoft.com/office/2006/metadata/properties" ma:root="true" ma:fieldsID="cc2c149e99f10870fd5bc3964e5386d3" ns2:_="" ns3:_="">
     <xsd:import namespace="42760c81-fd8e-4d59-8953-7cdb9f38b14f"/>
     <xsd:import namespace="67a0edcd-0de5-43ed-8c27-e32f38a00c91"/>
     <xsd:element name="properties">
@@ -14310,6 +14693,7 @@
                 <xsd:element ref="ns2:lcf76f155ced4ddcb4097134ff3c332f" minOccurs="0"/>
                 <xsd:element ref="ns3:TaxCatchAll" minOccurs="0"/>
                 <xsd:element ref="ns2:MediaServiceOCR" minOccurs="0"/>
+                <xsd:element ref="ns2:MediaServiceLocation" minOccurs="0"/>
               </xsd:all>
             </xsd:complexType>
           </xsd:element>
@@ -14367,6 +14751,11 @@
         <xsd:restriction base="dms:Note">
           <xsd:maxLength value="255"/>
         </xsd:restriction>
+      </xsd:simpleType>
+    </xsd:element>
+    <xsd:element name="MediaServiceLocation" ma:index="19" nillable="true" ma:displayName="Location" ma:description="" ma:indexed="true" ma:internalName="MediaServiceLocation" ma:readOnly="true">
+      <xsd:simpleType>
+        <xsd:restriction base="dms:Text"/>
       </xsd:simpleType>
     </xsd:element>
   </xsd:schema>
@@ -14485,14 +14874,7 @@
 </file>
 
 <file path=customXml/item2.xml><?xml version="1.0" encoding="utf-8"?>
-<p:properties xmlns:p="http://schemas.microsoft.com/office/2006/metadata/properties" xmlns:xsi="http://www.w3.org/2001/XMLSchema-instance" xmlns:pc="http://schemas.microsoft.com/office/infopath/2007/PartnerControls">
-  <documentManagement>
-    <TaxCatchAll xmlns="67a0edcd-0de5-43ed-8c27-e32f38a00c91" xsi:nil="true"/>
-    <lcf76f155ced4ddcb4097134ff3c332f xmlns="42760c81-fd8e-4d59-8953-7cdb9f38b14f">
-      <Terms xmlns="http://schemas.microsoft.com/office/infopath/2007/PartnerControls"/>
-    </lcf76f155ced4ddcb4097134ff3c332f>
-  </documentManagement>
-</p:properties>
+<b:Sources xmlns:b="http://schemas.openxmlformats.org/officeDocument/2006/bibliography" xmlns="http://schemas.openxmlformats.org/officeDocument/2006/bibliography" SelectedStyle="\APASixthEditionOfficeOnline.xsl" StyleName="APA" Version="6"/>
 </file>
 
 <file path=customXml/item3.xml><?xml version="1.0" encoding="utf-8"?>
@@ -14505,20 +14887,24 @@
 </file>
 
 <file path=customXml/item4.xml><?xml version="1.0" encoding="utf-8"?>
-<b:Sources xmlns:b="http://schemas.openxmlformats.org/officeDocument/2006/bibliography" xmlns="http://schemas.openxmlformats.org/officeDocument/2006/bibliography" SelectedStyle="\APASixthEditionOfficeOnline.xsl" StyleName="APA" Version="6"/>
+<p:properties xmlns:p="http://schemas.microsoft.com/office/2006/metadata/properties" xmlns:xsi="http://www.w3.org/2001/XMLSchema-instance" xmlns:pc="http://schemas.microsoft.com/office/infopath/2007/PartnerControls">
+  <documentManagement>
+    <TaxCatchAll xmlns="67a0edcd-0de5-43ed-8c27-e32f38a00c91" xsi:nil="true"/>
+    <lcf76f155ced4ddcb4097134ff3c332f xmlns="42760c81-fd8e-4d59-8953-7cdb9f38b14f">
+      <Terms xmlns="http://schemas.microsoft.com/office/infopath/2007/PartnerControls"/>
+    </lcf76f155ced4ddcb4097134ff3c332f>
+  </documentManagement>
+</p:properties>
 </file>
 
 <file path=customXml/itemProps1.xml><?xml version="1.0" encoding="utf-8"?>
-<ds:datastoreItem xmlns:ds="http://schemas.openxmlformats.org/officeDocument/2006/customXml" ds:itemID="{C24EB9DB-51D2-422A-8030-460FE42E9DF9}"/>
+<ds:datastoreItem xmlns:ds="http://schemas.openxmlformats.org/officeDocument/2006/customXml" ds:itemID="{972AE759-02DE-4E40-A8A6-37942A5A3247}"/>
 </file>
 
 <file path=customXml/itemProps2.xml><?xml version="1.0" encoding="utf-8"?>
-<ds:datastoreItem xmlns:ds="http://schemas.openxmlformats.org/officeDocument/2006/customXml" ds:itemID="{1145D752-ACC1-45E1-AB53-0C756F67FC7F}">
+<ds:datastoreItem xmlns:ds="http://schemas.openxmlformats.org/officeDocument/2006/customXml" ds:itemID="{E8AB44A3-7C62-4BD2-82ED-8ABC209970FA}">
   <ds:schemaRefs>
-    <ds:schemaRef ds:uri="http://schemas.microsoft.com/office/2006/metadata/properties"/>
-    <ds:schemaRef ds:uri="http://schemas.microsoft.com/office/infopath/2007/PartnerControls"/>
-    <ds:schemaRef ds:uri="adccf511-daff-4bcb-9072-914cedbf4c7e"/>
-    <ds:schemaRef ds:uri="a70d3c18-0869-45a1-9f75-4b4b8f0f32be"/>
+    <ds:schemaRef ds:uri="http://schemas.openxmlformats.org/officeDocument/2006/bibliography"/>
   </ds:schemaRefs>
 </ds:datastoreItem>
 </file>
@@ -14532,9 +14918,12 @@
 </file>
 
 <file path=customXml/itemProps4.xml><?xml version="1.0" encoding="utf-8"?>
-<ds:datastoreItem xmlns:ds="http://schemas.openxmlformats.org/officeDocument/2006/customXml" ds:itemID="{E8AB44A3-7C62-4BD2-82ED-8ABC209970FA}">
+<ds:datastoreItem xmlns:ds="http://schemas.openxmlformats.org/officeDocument/2006/customXml" ds:itemID="{1145D752-ACC1-45E1-AB53-0C756F67FC7F}">
   <ds:schemaRefs>
-    <ds:schemaRef ds:uri="http://schemas.openxmlformats.org/officeDocument/2006/bibliography"/>
+    <ds:schemaRef ds:uri="http://schemas.microsoft.com/office/2006/metadata/properties"/>
+    <ds:schemaRef ds:uri="http://schemas.microsoft.com/office/infopath/2007/PartnerControls"/>
+    <ds:schemaRef ds:uri="adccf511-daff-4bcb-9072-914cedbf4c7e"/>
+    <ds:schemaRef ds:uri="a70d3c18-0869-45a1-9f75-4b4b8f0f32be"/>
   </ds:schemaRefs>
 </ds:datastoreItem>
 </file>
</xml_diff>

<commit_message>
Ajustes de hallazgos repo 2-1
</commit_message>
<xml_diff>
--- a/fuentes/124108_CF01_DU.docx
+++ b/fuentes/124108_CF01_DU.docx
@@ -2089,7 +2089,7 @@
           <w:noProof/>
         </w:rPr>
         <w:drawing>
-          <wp:inline distT="0" distB="0" distL="0" distR="0" wp14:anchorId="0C5228ED" wp14:editId="401AE8FC">
+          <wp:inline distT="0" distB="0" distL="0" distR="0" wp14:anchorId="0C5228ED" wp14:editId="5FFF522D">
             <wp:extent cx="4680000" cy="2632500"/>
             <wp:effectExtent l="0" t="0" r="6350" b="0"/>
             <wp:docPr id="1" name="Imagen 1">
@@ -2780,21 +2780,7 @@
         <w:rPr>
           <w:lang w:val="es-419" w:eastAsia="es-CO"/>
         </w:rPr>
-        <w:t xml:space="preserve">(American Marketing </w:t>
-      </w:r>
-      <w:proofErr w:type="spellStart"/>
-      <w:r>
-        <w:rPr>
-          <w:lang w:val="es-419" w:eastAsia="es-CO"/>
-        </w:rPr>
-        <w:t>Association</w:t>
-      </w:r>
-      <w:proofErr w:type="spellEnd"/>
-      <w:r>
-        <w:rPr>
-          <w:lang w:val="es-419" w:eastAsia="es-CO"/>
-        </w:rPr>
-        <w:t>, 2017).</w:t>
+        <w:t>(American Marketing Association, 2017).</w:t>
       </w:r>
     </w:p>
     <w:p>
@@ -2927,21 +2913,7 @@
         <w:rPr>
           <w:lang w:val="es-419" w:eastAsia="es-CO"/>
         </w:rPr>
-        <w:t xml:space="preserve">De acuerdo con Solomon y Stuart (como se citó en </w:t>
-      </w:r>
-      <w:proofErr w:type="spellStart"/>
-      <w:r>
-        <w:rPr>
-          <w:lang w:val="es-419" w:eastAsia="es-CO"/>
-        </w:rPr>
-        <w:t>Rosenstiehl</w:t>
-      </w:r>
-      <w:proofErr w:type="spellEnd"/>
-      <w:r>
-        <w:rPr>
-          <w:lang w:val="es-419" w:eastAsia="es-CO"/>
-        </w:rPr>
-        <w:t xml:space="preserve">, 2016), “el concepto de </w:t>
+        <w:t xml:space="preserve">De acuerdo con Solomon y Stuart (como se citó en Rosenstiehl, 2016), “el concepto de </w:t>
       </w:r>
       <w:r>
         <w:rPr>
@@ -3344,23 +3316,7 @@
                 <w:rFonts w:cstheme="minorHAnsi"/>
                 <w:szCs w:val="28"/>
               </w:rPr>
-              <w:t xml:space="preserve">Uno de los acontecimientos que se convierte en un hito para la evolución del </w:t>
-            </w:r>
-            <w:proofErr w:type="spellStart"/>
-            <w:r>
-              <w:rPr>
-                <w:rFonts w:cstheme="minorHAnsi"/>
-                <w:szCs w:val="28"/>
-              </w:rPr>
-              <w:t>mercadeo</w:t>
-            </w:r>
-            <w:proofErr w:type="spellEnd"/>
-            <w:r>
-              <w:rPr>
-                <w:rFonts w:cstheme="minorHAnsi"/>
-                <w:szCs w:val="28"/>
-              </w:rPr>
-              <w:t xml:space="preserve"> es la imprenta, que aparece en 1440, pues acompaña y ayuda en el proceso de comunicación, materializando medios impresos para dar a conocer la oferta de bienes y servicios</w:t>
+              <w:t>Uno de los acontecimientos que se convierte en un hito para la evolución del mercadeo es la imprenta, que aparece en 1440, pues acompaña y ayuda en el proceso de comunicación, materializando medios impresos para dar a conocer la oferta de bienes y servicios</w:t>
             </w:r>
             <w:r>
               <w:rPr>
@@ -3588,17 +3544,8 @@
                 <w:rFonts w:cstheme="minorHAnsi"/>
                 <w:szCs w:val="28"/>
               </w:rPr>
-              <w:t xml:space="preserve">Esta intensidad competitiva establece en gran medida la evolución del </w:t>
-            </w:r>
-            <w:proofErr w:type="spellStart"/>
-            <w:r>
-              <w:rPr>
-                <w:rFonts w:cstheme="minorHAnsi"/>
-                <w:szCs w:val="28"/>
-              </w:rPr>
-              <w:t>mercadeo</w:t>
-            </w:r>
-            <w:proofErr w:type="spellEnd"/>
+              <w:t>Esta intensidad competitiva establece en gran medida la evolución del mercadeo</w:t>
+            </w:r>
             <w:r>
               <w:rPr>
                 <w:rFonts w:cstheme="minorHAnsi"/>
@@ -4404,53 +4351,26 @@
         </w:rPr>
         <w:t>, el cual engloba los cuatros componentes básicos: precio, producto, comunicación y distribución. Estas variables son conocidas como las 4P por su acepción anglosajona (</w:t>
       </w:r>
-      <w:proofErr w:type="spellStart"/>
       <w:r>
         <w:rPr>
           <w:rStyle w:val="Extranjerismo"/>
           <w:lang w:val="es-419" w:eastAsia="es-CO"/>
         </w:rPr>
-        <w:t>product</w:t>
-      </w:r>
-      <w:proofErr w:type="spellEnd"/>
+        <w:t>product, price, place</w:t>
+      </w:r>
+      <w:r>
+        <w:rPr>
+          <w:lang w:val="es-419" w:eastAsia="es-CO"/>
+        </w:rPr>
+        <w:t xml:space="preserve"> y </w:t>
+      </w:r>
       <w:r>
         <w:rPr>
           <w:rStyle w:val="Extranjerismo"/>
           <w:lang w:val="es-419" w:eastAsia="es-CO"/>
         </w:rPr>
-        <w:t xml:space="preserve">, </w:t>
-      </w:r>
-      <w:proofErr w:type="spellStart"/>
-      <w:r>
-        <w:rPr>
-          <w:rStyle w:val="Extranjerismo"/>
-          <w:lang w:val="es-419" w:eastAsia="es-CO"/>
-        </w:rPr>
-        <w:t>price</w:t>
-      </w:r>
-      <w:proofErr w:type="spellEnd"/>
-      <w:r>
-        <w:rPr>
-          <w:rStyle w:val="Extranjerismo"/>
-          <w:lang w:val="es-419" w:eastAsia="es-CO"/>
-        </w:rPr>
-        <w:t>, place</w:t>
-      </w:r>
-      <w:r>
-        <w:rPr>
-          <w:lang w:val="es-419" w:eastAsia="es-CO"/>
-        </w:rPr>
-        <w:t xml:space="preserve"> y </w:t>
-      </w:r>
-      <w:proofErr w:type="spellStart"/>
-      <w:r>
-        <w:rPr>
-          <w:rStyle w:val="Extranjerismo"/>
-          <w:lang w:val="es-419" w:eastAsia="es-CO"/>
-        </w:rPr>
         <w:t>promotion</w:t>
       </w:r>
-      <w:proofErr w:type="spellEnd"/>
       <w:r>
         <w:rPr>
           <w:lang w:val="es-419" w:eastAsia="es-CO"/>
@@ -4893,21 +4813,7 @@
         <w:rPr>
           <w:lang w:val="es-419" w:eastAsia="es-CO"/>
         </w:rPr>
-        <w:t xml:space="preserve">Con las 4C, se distinguen cuatro importantes aspectos a tener en cuenta para entender y desplegar una estrategia. Ellos son: consumidor, costo, conveniencia y comunicación. Este modelo fue propuesto por Robert F. Lauterborn, en 1990, quien vio la necesidad de actualizar, al entorno digital, el modelo del </w:t>
-      </w:r>
-      <w:proofErr w:type="spellStart"/>
-      <w:r>
-        <w:rPr>
-          <w:lang w:val="es-419" w:eastAsia="es-CO"/>
-        </w:rPr>
-        <w:t>mercadeo</w:t>
-      </w:r>
-      <w:proofErr w:type="spellEnd"/>
-      <w:r>
-        <w:rPr>
-          <w:lang w:val="es-419" w:eastAsia="es-CO"/>
-        </w:rPr>
-        <w:t xml:space="preserve"> tradicional de 4P (producto, precio, plaza y promoción), sin perder su esencia (Shum Xie, 2019</w:t>
+        <w:t>Con las 4C, se distinguen cuatro importantes aspectos a tener en cuenta para entender y desplegar una estrategia. Ellos son: consumidor, costo, conveniencia y comunicación. Este modelo fue propuesto por Robert F. Lauterborn, en 1990, quien vio la necesidad de actualizar, al entorno digital, el modelo del mercadeo tradicional de 4P (producto, precio, plaza y promoción), sin perder su esencia (Shum Xie, 2019</w:t>
       </w:r>
       <w:r>
         <w:rPr>
@@ -6440,7 +6346,6 @@
         </w:rPr>
         <w:t xml:space="preserve">Establecer </w:t>
       </w:r>
-      <w:proofErr w:type="spellStart"/>
       <w:r>
         <w:rPr>
           <w:rStyle w:val="Extranjerismo"/>
@@ -6448,7 +6353,6 @@
         </w:rPr>
         <w:t>benchmarks</w:t>
       </w:r>
-      <w:proofErr w:type="spellEnd"/>
       <w:r>
         <w:rPr>
           <w:lang w:val="es-419" w:eastAsia="es-CO"/>
@@ -6588,17 +6492,8 @@
           <w:rStyle w:val="Extranjerismo"/>
           <w:lang w:val="es-419" w:eastAsia="es-CO"/>
         </w:rPr>
-        <w:t>e-</w:t>
-      </w:r>
-      <w:proofErr w:type="spellStart"/>
-      <w:r>
-        <w:rPr>
-          <w:rStyle w:val="Extranjerismo"/>
-          <w:lang w:val="es-419" w:eastAsia="es-CO"/>
-        </w:rPr>
-        <w:t>commerce</w:t>
-      </w:r>
-      <w:proofErr w:type="spellEnd"/>
+        <w:t>e-commerce</w:t>
+      </w:r>
       <w:r>
         <w:rPr>
           <w:lang w:val="es-419" w:eastAsia="es-CO"/>
@@ -6673,17 +6568,8 @@
           <w:rStyle w:val="Extranjerismo"/>
           <w:lang w:val="es-419" w:eastAsia="es-CO"/>
         </w:rPr>
-        <w:t>e-</w:t>
-      </w:r>
-      <w:proofErr w:type="spellStart"/>
-      <w:r>
-        <w:rPr>
-          <w:rStyle w:val="Extranjerismo"/>
-          <w:lang w:val="es-419" w:eastAsia="es-CO"/>
-        </w:rPr>
-        <w:t>commerce</w:t>
-      </w:r>
-      <w:proofErr w:type="spellEnd"/>
+        <w:t>e-commerce</w:t>
+      </w:r>
       <w:r>
         <w:rPr>
           <w:lang w:val="es-419" w:eastAsia="es-CO"/>
@@ -7275,17 +7161,8 @@
           <w:rStyle w:val="Extranjerismo"/>
           <w:lang w:val="es-419" w:eastAsia="es-CO"/>
         </w:rPr>
-        <w:t>e-</w:t>
-      </w:r>
-      <w:proofErr w:type="spellStart"/>
-      <w:r>
-        <w:rPr>
-          <w:rStyle w:val="Extranjerismo"/>
-          <w:lang w:val="es-419" w:eastAsia="es-CO"/>
-        </w:rPr>
-        <w:t>commerce</w:t>
-      </w:r>
-      <w:proofErr w:type="spellEnd"/>
+        <w:t>e-commerce</w:t>
+      </w:r>
       <w:r>
         <w:rPr>
           <w:lang w:val="es-419" w:eastAsia="es-CO"/>
@@ -7519,17 +7396,8 @@
           <w:rStyle w:val="Extranjerismo"/>
           <w:lang w:val="es-419" w:eastAsia="es-CO"/>
         </w:rPr>
-        <w:t>e-</w:t>
-      </w:r>
-      <w:proofErr w:type="spellStart"/>
-      <w:r>
-        <w:rPr>
-          <w:rStyle w:val="Extranjerismo"/>
-          <w:lang w:val="es-419" w:eastAsia="es-CO"/>
-        </w:rPr>
-        <w:t>commerce</w:t>
-      </w:r>
-      <w:proofErr w:type="spellEnd"/>
+        <w:t>e-commerce</w:t>
+      </w:r>
       <w:r>
         <w:rPr>
           <w:lang w:val="es-419" w:eastAsia="es-CO"/>
@@ -7665,23 +7533,7 @@
           <w:b/>
           <w:bCs/>
         </w:rPr>
-        <w:t xml:space="preserve">AMA (American Marketing </w:t>
-      </w:r>
-      <w:proofErr w:type="spellStart"/>
-      <w:r>
-        <w:rPr>
-          <w:b/>
-          <w:bCs/>
-        </w:rPr>
-        <w:t>Association</w:t>
-      </w:r>
-      <w:proofErr w:type="spellEnd"/>
-      <w:r>
-        <w:rPr>
-          <w:b/>
-          <w:bCs/>
-        </w:rPr>
-        <w:t>)</w:t>
+        <w:t>AMA (American Marketing Association)</w:t>
       </w:r>
       <w:r>
         <w:t xml:space="preserve">: organización de origen estadounidense que agrupa a los profesionales y educadores del </w:t>
@@ -7760,15 +7612,7 @@
     </w:p>
     <w:p>
       <w:r>
-        <w:t xml:space="preserve">American Marketing </w:t>
-      </w:r>
-      <w:proofErr w:type="spellStart"/>
-      <w:r>
-        <w:t>Association</w:t>
-      </w:r>
-      <w:proofErr w:type="spellEnd"/>
-      <w:r>
-        <w:t xml:space="preserve">. (2020, 3 de diciembre). </w:t>
+        <w:t xml:space="preserve">American Marketing Association. (2020, 3 de diciembre). </w:t>
       </w:r>
       <w:r>
         <w:rPr>
@@ -8242,7 +8086,7 @@
                 <w:rFonts w:eastAsiaTheme="minorEastAsia"/>
                 <w:color w:val="000000"/>
               </w:rPr>
-              <w:t>Profesional 06. Responsable Ecosistema Virtual de Recursos Educativos Digitales</w:t>
+              <w:t>Responsable Nacional Ecosistema de Recursos Educativos Digitales (RED) - Profesional 06</w:t>
             </w:r>
           </w:p>
         </w:tc>
@@ -8434,11 +8278,15 @@
                 <w:szCs w:val="24"/>
               </w:rPr>
             </w:pPr>
-            <w:proofErr w:type="spellStart"/>
-            <w:r>
-              <w:t>Maria</w:t>
-            </w:r>
-            <w:proofErr w:type="spellEnd"/>
+            <w:r>
+              <w:t>Mar</w:t>
+            </w:r>
+            <w:r>
+              <w:t>i</w:t>
+            </w:r>
+            <w:r>
+              <w:t>a</w:t>
+            </w:r>
             <w:r>
               <w:t xml:space="preserve"> Camila Álvarez</w:t>
             </w:r>
@@ -8530,7 +8378,13 @@
               <w:pStyle w:val="TextoTablas"/>
             </w:pPr>
             <w:r>
-              <w:t>Centro de Diseño Y Metrología – Regional Distrito Capital</w:t>
+              <w:t xml:space="preserve">Centro de Diseño Y Metrología </w:t>
+            </w:r>
+            <w:r>
+              <w:t>-</w:t>
+            </w:r>
+            <w:r>
+              <w:t xml:space="preserve"> Regional Distrito Capital</w:t>
             </w:r>
           </w:p>
         </w:tc>
@@ -8571,7 +8425,13 @@
               <w:pStyle w:val="TextoTablas"/>
             </w:pPr>
             <w:r>
-              <w:t>Uriel Darío González Montoya</w:t>
+              <w:t xml:space="preserve">Centro Agropecuario La Granja </w:t>
+            </w:r>
+            <w:r>
+              <w:t>-</w:t>
+            </w:r>
+            <w:r>
+              <w:t xml:space="preserve"> Regional Tolima</w:t>
             </w:r>
           </w:p>
         </w:tc>
@@ -9056,13 +8916,8 @@
               </w:rPr>
             </w:pPr>
             <w:r>
-              <w:t xml:space="preserve">Gilberto Junior Rodríguez </w:t>
-            </w:r>
-            <w:proofErr w:type="spellStart"/>
-            <w:r>
-              <w:t>Rodríguez</w:t>
-            </w:r>
-            <w:proofErr w:type="spellEnd"/>
+              <w:t>Gilberto Junior Rodríguez Rodríguez</w:t>
+            </w:r>
           </w:p>
         </w:tc>
         <w:tc>
@@ -9243,13 +9098,8 @@
                 <w:szCs w:val="24"/>
               </w:rPr>
             </w:pPr>
-            <w:proofErr w:type="spellStart"/>
-            <w:r>
-              <w:t>Ludwyng</w:t>
-            </w:r>
-            <w:proofErr w:type="spellEnd"/>
-            <w:r>
-              <w:t xml:space="preserve"> Corzo</w:t>
+            <w:r>
+              <w:t>Ludwyng Corzo</w:t>
             </w:r>
           </w:p>
         </w:tc>
@@ -14673,6 +14523,10 @@
 </file>
 
 <file path=customXml/item1.xml><?xml version="1.0" encoding="utf-8"?>
+<b:Sources xmlns:b="http://schemas.openxmlformats.org/officeDocument/2006/bibliography" xmlns="http://schemas.openxmlformats.org/officeDocument/2006/bibliography" SelectedStyle="\APASixthEditionOfficeOnline.xsl" StyleName="APA" Version="6"/>
+</file>
+
+<file path=customXml/item2.xml><?xml version="1.0" encoding="utf-8"?>
 <ct:contentTypeSchema xmlns:ct="http://schemas.microsoft.com/office/2006/metadata/contentType" xmlns:ma="http://schemas.microsoft.com/office/2006/metadata/properties/metaAttributes" ct:_="" ma:_="" ma:contentTypeName="Documento" ma:contentTypeID="0x01010005252A1EF3BD024F856B47B579AB5244" ma:contentTypeVersion="12" ma:contentTypeDescription="Crear nuevo documento." ma:contentTypeScope="" ma:versionID="32d0e18b85ac20c34eab62df21c0cf58">
   <xsd:schema xmlns:xsd="http://www.w3.org/2001/XMLSchema" xmlns:xs="http://www.w3.org/2001/XMLSchema" xmlns:p="http://schemas.microsoft.com/office/2006/metadata/properties" xmlns:ns2="42760c81-fd8e-4d59-8953-7cdb9f38b14f" xmlns:ns3="67a0edcd-0de5-43ed-8c27-e32f38a00c91" targetNamespace="http://schemas.microsoft.com/office/2006/metadata/properties" ma:root="true" ma:fieldsID="cc2c149e99f10870fd5bc3964e5386d3" ns2:_="" ns3:_="">
     <xsd:import namespace="42760c81-fd8e-4d59-8953-7cdb9f38b14f"/>
@@ -14873,20 +14727,7 @@
 </ct:contentTypeSchema>
 </file>
 
-<file path=customXml/item2.xml><?xml version="1.0" encoding="utf-8"?>
-<b:Sources xmlns:b="http://schemas.openxmlformats.org/officeDocument/2006/bibliography" xmlns="http://schemas.openxmlformats.org/officeDocument/2006/bibliography" SelectedStyle="\APASixthEditionOfficeOnline.xsl" StyleName="APA" Version="6"/>
-</file>
-
 <file path=customXml/item3.xml><?xml version="1.0" encoding="utf-8"?>
-<?mso-contentType ?>
-<FormTemplates xmlns="http://schemas.microsoft.com/sharepoint/v3/contenttype/forms">
-  <Display>DocumentLibraryForm</Display>
-  <Edit>DocumentLibraryForm</Edit>
-  <New>DocumentLibraryForm</New>
-</FormTemplates>
-</file>
-
-<file path=customXml/item4.xml><?xml version="1.0" encoding="utf-8"?>
 <p:properties xmlns:p="http://schemas.microsoft.com/office/2006/metadata/properties" xmlns:xsi="http://www.w3.org/2001/XMLSchema-instance" xmlns:pc="http://schemas.microsoft.com/office/infopath/2007/PartnerControls">
   <documentManagement>
     <TaxCatchAll xmlns="67a0edcd-0de5-43ed-8c27-e32f38a00c91" xsi:nil="true"/>
@@ -14897,11 +14738,16 @@
 </p:properties>
 </file>
 
-<file path=customXml/itemProps1.xml><?xml version="1.0" encoding="utf-8"?>
-<ds:datastoreItem xmlns:ds="http://schemas.openxmlformats.org/officeDocument/2006/customXml" ds:itemID="{972AE759-02DE-4E40-A8A6-37942A5A3247}"/>
+<file path=customXml/item4.xml><?xml version="1.0" encoding="utf-8"?>
+<?mso-contentType ?>
+<FormTemplates xmlns="http://schemas.microsoft.com/sharepoint/v3/contenttype/forms">
+  <Display>DocumentLibraryForm</Display>
+  <Edit>DocumentLibraryForm</Edit>
+  <New>DocumentLibraryForm</New>
+</FormTemplates>
 </file>
 
-<file path=customXml/itemProps2.xml><?xml version="1.0" encoding="utf-8"?>
+<file path=customXml/itemProps1.xml><?xml version="1.0" encoding="utf-8"?>
 <ds:datastoreItem xmlns:ds="http://schemas.openxmlformats.org/officeDocument/2006/customXml" ds:itemID="{E8AB44A3-7C62-4BD2-82ED-8ABC209970FA}">
   <ds:schemaRefs>
     <ds:schemaRef ds:uri="http://schemas.openxmlformats.org/officeDocument/2006/bibliography"/>
@@ -14909,15 +14755,11 @@
 </ds:datastoreItem>
 </file>
 
-<file path=customXml/itemProps3.xml><?xml version="1.0" encoding="utf-8"?>
-<ds:datastoreItem xmlns:ds="http://schemas.openxmlformats.org/officeDocument/2006/customXml" ds:itemID="{81CBDEC1-3B00-44ED-AD36-0268077980BA}">
-  <ds:schemaRefs>
-    <ds:schemaRef ds:uri="http://schemas.microsoft.com/sharepoint/v3/contenttype/forms"/>
-  </ds:schemaRefs>
-</ds:datastoreItem>
+<file path=customXml/itemProps2.xml><?xml version="1.0" encoding="utf-8"?>
+<ds:datastoreItem xmlns:ds="http://schemas.openxmlformats.org/officeDocument/2006/customXml" ds:itemID="{2E76A55E-01FB-401A-B9BC-A3C71E9017DD}"/>
 </file>
 
-<file path=customXml/itemProps4.xml><?xml version="1.0" encoding="utf-8"?>
+<file path=customXml/itemProps3.xml><?xml version="1.0" encoding="utf-8"?>
 <ds:datastoreItem xmlns:ds="http://schemas.openxmlformats.org/officeDocument/2006/customXml" ds:itemID="{1145D752-ACC1-45E1-AB53-0C756F67FC7F}">
   <ds:schemaRefs>
     <ds:schemaRef ds:uri="http://schemas.microsoft.com/office/2006/metadata/properties"/>
@@ -14926,4 +14768,12 @@
     <ds:schemaRef ds:uri="a70d3c18-0869-45a1-9f75-4b4b8f0f32be"/>
   </ds:schemaRefs>
 </ds:datastoreItem>
+</file>
+
+<file path=customXml/itemProps4.xml><?xml version="1.0" encoding="utf-8"?>
+<ds:datastoreItem xmlns:ds="http://schemas.openxmlformats.org/officeDocument/2006/customXml" ds:itemID="{81CBDEC1-3B00-44ED-AD36-0268077980BA}">
+  <ds:schemaRefs>
+    <ds:schemaRef ds:uri="http://schemas.microsoft.com/sharepoint/v3/contenttype/forms"/>
+  </ds:schemaRefs>
+</ds:datastoreItem>
 </file>
</xml_diff>